<commit_message>
Rewrite bilingual guide with use-case focus (v2)
Restructure the illustrated bilingual (CN/EN) guide to lead with three
real-world scenarios: cross-border e-commerce, multilingual product
catalogues, and multilingual manuals. Each scenario has a pain-point
column and a "how this skill helps" column.

Both READMEs now carry a matching Use Cases table right after the intro.
</commit_message>
<xml_diff>
--- a/docs/figma-translate-guide-bilingual.docx
+++ b/docs/figma-translate-guide-bilingual.docx
@@ -4,7 +4,7 @@
   <w:body>
     <w:p>
       <w:pPr>
-        <w:spacing w:before="0" w:after="1100" w:line="276" w:lineRule="auto"/>
+        <w:spacing w:before="0" w:after="900" w:line="276" w:lineRule="auto"/>
       </w:pPr>
     </w:p>
     <w:p>
@@ -20,12 +20,12 @@
           <w:sz w:val="52"/>
           <w:szCs w:val="52"/>
         </w:rPr>
-        <w:t xml:space="preserve">Figma 自动翻译 Skill</w:t>
-      </w:r>
-    </w:p>
-    <w:p>
-      <w:pPr>
-        <w:spacing w:before="0" w:after="200" w:line="300" w:lineRule="auto"/>
+        <w:t xml:space="preserve">Figma 整页自动翻译 Skill</w:t>
+      </w:r>
+    </w:p>
+    <w:p>
+      <w:pPr>
+        <w:spacing w:before="0" w:after="160" w:line="300" w:lineRule="auto"/>
         <w:jc w:val="center"/>
       </w:pPr>
       <w:r>
@@ -56,7 +56,7 @@
     </w:p>
     <w:p>
       <w:pPr>
-        <w:spacing w:before="0" w:after="240" w:line="300" w:lineRule="auto"/>
+        <w:spacing w:before="0" w:after="200" w:line="300" w:lineRule="auto"/>
         <w:jc w:val="center"/>
       </w:pPr>
       <w:r>
@@ -71,6 +71,37 @@
     </w:p>
     <w:p>
       <w:pPr>
+        <w:spacing w:before="0" w:after="20" w:line="300" w:lineRule="auto"/>
+        <w:jc w:val="center"/>
+      </w:pPr>
+      <w:r>
+        <w:rPr>
+          <w:rFonts w:ascii="Microsoft YaHei" w:hAnsi="Microsoft YaHei" w:eastAsia="Microsoft YaHei" w:cs="Microsoft YaHei"/>
+          <w:b/>
+          <w:color w:val="2E5C8A"/>
+          <w:sz w:val="26"/>
+          <w:szCs w:val="26"/>
+        </w:rPr>
+        <w:t xml:space="preserve">电商出海 · 多语言产品图册 · 多语言说明书</w:t>
+      </w:r>
+    </w:p>
+    <w:p>
+      <w:pPr>
+        <w:spacing w:before="0" w:after="160" w:line="300" w:lineRule="auto"/>
+        <w:jc w:val="center"/>
+      </w:pPr>
+      <w:r>
+        <w:rPr>
+          <w:rFonts w:ascii="Segoe UI" w:hAnsi="Segoe UI" w:eastAsia="Segoe UI" w:cs="Segoe UI"/>
+          <w:color w:val="808080"/>
+          <w:sz w:val="20"/>
+          <w:szCs w:val="20"/>
+        </w:rPr>
+        <w:t xml:space="preserve">Cross-border e-commerce · Multilingual product catalogues · Multilingual manuals</w:t>
+      </w:r>
+    </w:p>
+    <w:p>
+      <w:pPr>
         <w:spacing w:before="0" w:after="40" w:line="276" w:lineRule="auto"/>
         <w:jc w:val="center"/>
       </w:pPr>
@@ -86,7 +117,7 @@
     </w:p>
     <w:p>
       <w:pPr>
-        <w:spacing w:before="0" w:after="600" w:line="276" w:lineRule="auto"/>
+        <w:spacing w:before="0" w:after="400" w:line="276" w:lineRule="auto"/>
         <w:jc w:val="center"/>
       </w:pPr>
       <w:r>
@@ -279,21 +310,21 @@
                 <w:sz w:val="19"/>
                 <w:szCs w:val="19"/>
               </w:rPr>
-              <w:t xml:space="preserve">Figma 多语言手册 / 产品画册 / 详情页的本地化团队、设计师、外贸运营</w:t>
-            </w:r>
-          </w:p>
-          <w:p>
-            <w:pPr>
-              <w:spacing w:before="40" w:after="40" w:line="252" w:lineRule="auto"/>
-            </w:pPr>
-            <w:r>
-              <w:rPr>
-                <w:rFonts w:ascii="Segoe UI" w:hAnsi="Segoe UI" w:eastAsia="Segoe UI" w:cs="Segoe UI"/>
-                <w:color w:val="595959"/>
-                <w:sz w:val="17"/>
-                <w:szCs w:val="17"/>
-              </w:rPr>
-              <w:t xml:space="preserve">Localization teams, designers and export-trade operators working on multilingual Figma manuals, catalogues and product pages.</w:t>
+              <w:t xml:space="preserve">电商出海团队的 Figma 多语言产品图册、说明书、详情页本地化</w:t>
+            </w:r>
+          </w:p>
+          <w:p>
+            <w:pPr>
+              <w:spacing w:before="40" w:after="40" w:line="252" w:lineRule="auto"/>
+            </w:pPr>
+            <w:r>
+              <w:rPr>
+                <w:rFonts w:ascii="Segoe UI" w:hAnsi="Segoe UI" w:eastAsia="Segoe UI" w:cs="Segoe UI"/>
+                <w:color w:val="595959"/>
+                <w:sz w:val="17"/>
+                <w:szCs w:val="17"/>
+              </w:rPr>
+              <w:t xml:space="preserve">Cross-border e-commerce teams localizing Figma product catalogues, manuals and detail pages into multiple languages.</w:t>
             </w:r>
           </w:p>
         </w:tc>
@@ -615,21 +646,21 @@
                 <w:sz w:val="19"/>
                 <w:szCs w:val="19"/>
               </w:rPr>
-              <w:t xml:space="preserve">v1.0 · 2026-09-01 · MIT 开源</w:t>
-            </w:r>
-          </w:p>
-          <w:p>
-            <w:pPr>
-              <w:spacing w:before="40" w:after="40" w:line="252" w:lineRule="auto"/>
-            </w:pPr>
-            <w:r>
-              <w:rPr>
-                <w:rFonts w:ascii="Segoe UI" w:hAnsi="Segoe UI" w:eastAsia="Segoe UI" w:cs="Segoe UI"/>
-                <w:color w:val="595959"/>
-                <w:sz w:val="17"/>
-                <w:szCs w:val="17"/>
-              </w:rPr>
-              <w:t xml:space="preserve">v1.0 · 2026-09-01 · MIT licensed</w:t>
+              <w:t xml:space="preserve">v2.0 · 2026-09-02 · MIT 开源</w:t>
+            </w:r>
+          </w:p>
+          <w:p>
+            <w:pPr>
+              <w:spacing w:before="40" w:after="40" w:line="252" w:lineRule="auto"/>
+            </w:pPr>
+            <w:r>
+              <w:rPr>
+                <w:rFonts w:ascii="Segoe UI" w:hAnsi="Segoe UI" w:eastAsia="Segoe UI" w:cs="Segoe UI"/>
+                <w:color w:val="595959"/>
+                <w:sz w:val="17"/>
+                <w:szCs w:val="17"/>
+              </w:rPr>
+              <w:t xml:space="preserve">v2.0 · 2026-09-02 · MIT licensed</w:t>
             </w:r>
           </w:p>
         </w:tc>
@@ -653,7 +684,7 @@
           <w:sz w:val="30"/>
           <w:szCs w:val="30"/>
         </w:rPr>
-        <w:t xml:space="preserve">一、这个 Skill 是什么</w:t>
+        <w:t>一、适用场景</w:t>
       </w:r>
       <w:r>
         <w:rPr>
@@ -671,7 +702,762 @@
           <w:sz w:val="25"/>
           <w:szCs w:val="25"/>
         </w:rPr>
-        <w:t xml:space="preserve">1. What This Skill Is</w:t>
+        <w:t xml:space="preserve">1. Use Cases</w:t>
+      </w:r>
+    </w:p>
+    <w:p>
+      <w:pPr>
+        <w:spacing w:before="0" w:after="40" w:line="300" w:lineRule="auto"/>
+      </w:pPr>
+      <w:r>
+        <w:rPr>
+          <w:rFonts w:ascii="Microsoft YaHei" w:hAnsi="Microsoft YaHei" w:eastAsia="Microsoft YaHei" w:cs="Microsoft YaHei"/>
+          <w:color w:val="000000"/>
+          <w:sz w:val="21"/>
+          <w:szCs w:val="21"/>
+        </w:rPr>
+        <w:t xml:space="preserve">这个 Skill 不是通用翻译工具——它专门解决一个真实的痛点：跨境电商 / 工业制造企业在 Figma 里做好了产品图册或说明书的设计稿，需要同时输出阿拉伯语、西班牙语、俄语、土耳其语等多个语言版本。传统做法是设计师把每页复制一份、逐个文本框手动改字，既慢又容易出错，阿拉伯语的 RTL 排版更是几乎没法手动搞定。</w:t>
+      </w:r>
+    </w:p>
+    <w:p>
+      <w:pPr>
+        <w:spacing w:before="0" w:after="200" w:line="300" w:lineRule="auto"/>
+      </w:pPr>
+      <w:r>
+        <w:rPr>
+          <w:rFonts w:ascii="Segoe UI" w:hAnsi="Segoe UI" w:eastAsia="Segoe UI" w:cs="Segoe UI"/>
+          <w:color w:val="404040"/>
+          <w:sz w:val="19"/>
+          <w:szCs w:val="19"/>
+        </w:rPr>
+        <w:t xml:space="preserve">This skill is not a general-purpose translator. It solves one real pain point: cross-border e-commerce and industrial manufacturers who design product catalogues or manuals in Figma and need to output Arabic, Spanish, Russian, Turkish and other language versions simultaneously. The traditional approach — duplicating each page and changing text frame by frame by hand — is slow, error-prone, and nearly impossible for Arabic RTL.</w:t>
+      </w:r>
+    </w:p>
+    <w:p>
+      <w:pPr>
+        <w:spacing w:before="120" w:after="100" w:line="276" w:lineRule="auto"/>
+      </w:pPr>
+      <w:r>
+        <w:rPr>
+          <w:rFonts w:ascii="Microsoft YaHei" w:hAnsi="Microsoft YaHei" w:eastAsia="Microsoft YaHei" w:cs="Microsoft YaHei"/>
+          <w:b/>
+          <w:color w:val="2E5C8A"/>
+          <w:sz w:val="23"/>
+          <w:szCs w:val="23"/>
+        </w:rPr>
+        <w:t>三大典型场景</w:t>
+      </w:r>
+      <w:r>
+        <w:rPr>
+          <w:rFonts w:ascii="Microsoft YaHei" w:hAnsi="Microsoft YaHei" w:eastAsia="Microsoft YaHei" w:cs="Microsoft YaHei"/>
+          <w:sz w:val="23"/>
+          <w:szCs w:val="23"/>
+        </w:rPr>
+        <w:t xml:space="preserve">    </w:t>
+      </w:r>
+      <w:r>
+        <w:rPr>
+          <w:rFonts w:ascii="Segoe UI" w:hAnsi="Segoe UI" w:eastAsia="Segoe UI" w:cs="Segoe UI"/>
+          <w:b/>
+          <w:color w:val="7F9DB9"/>
+          <w:sz w:val="20"/>
+          <w:szCs w:val="20"/>
+        </w:rPr>
+        <w:t xml:space="preserve">Three typical scenarios</w:t>
+      </w:r>
+    </w:p>
+    <w:tbl>
+      <w:tblPr>
+        <w:tblW w:w="9638" w:type="dxa"/>
+        <w:tblBorders>
+          <w:top w:val="single" w:sz="4" w:space="0" w:color="BFBFBF"/>
+          <w:left w:val="single" w:sz="4" w:space="0" w:color="BFBFBF"/>
+          <w:bottom w:val="single" w:sz="4" w:space="0" w:color="BFBFBF"/>
+          <w:right w:val="single" w:sz="4" w:space="0" w:color="BFBFBF"/>
+          <w:insideH w:val="single" w:sz="4" w:space="0" w:color="BFBFBF"/>
+          <w:insideV w:val="single" w:sz="4" w:space="0" w:color="BFBFBF"/>
+        </w:tblBorders>
+        <w:tblCellMar>
+          <w:top w:w="0" w:type="dxa"/>
+          <w:left w:w="0" w:type="dxa"/>
+          <w:bottom w:w="0" w:type="dxa"/>
+          <w:right w:w="0" w:type="dxa"/>
+        </w:tblCellMar>
+      </w:tblPr>
+      <w:tblGrid>
+        <w:gridCol w:w="2000"/>
+        <w:gridCol w:w="3200"/>
+        <w:gridCol w:w="4438"/>
+      </w:tblGrid>
+      <w:tr>
+        <w:trPr>
+          <w:tblHeader/>
+        </w:trPr>
+        <w:tc>
+          <w:tcPr>
+            <w:tcW w:w="2000" w:type="dxa"/>
+            <w:shd w:val="clear" w:color="auto" w:fill="DEEAF6"/>
+            <w:tcMar>
+              <w:top w:w="90" w:type="dxa"/>
+              <w:left w:w="110" w:type="dxa"/>
+              <w:bottom w:w="90" w:type="dxa"/>
+              <w:right w:w="110" w:type="dxa"/>
+            </w:tcMar>
+            <w:vAlign w:val="center"/>
+          </w:tcPr>
+          <w:p>
+            <w:pPr>
+              <w:spacing w:before="40" w:after="40" w:line="252" w:lineRule="auto"/>
+              <w:jc w:val="center"/>
+            </w:pPr>
+            <w:r>
+              <w:rPr>
+                <w:rFonts w:ascii="Microsoft YaHei" w:hAnsi="Microsoft YaHei" w:eastAsia="Microsoft YaHei" w:cs="Microsoft YaHei"/>
+                <w:b/>
+                <w:color w:val="000000"/>
+                <w:sz w:val="20"/>
+                <w:szCs w:val="20"/>
+              </w:rPr>
+              <w:t>场景</w:t>
+            </w:r>
+          </w:p>
+          <w:p>
+            <w:pPr>
+              <w:spacing w:before="40" w:after="40" w:line="252" w:lineRule="auto"/>
+              <w:jc w:val="center"/>
+            </w:pPr>
+            <w:r>
+              <w:rPr>
+                <w:rFonts w:ascii="Segoe UI" w:hAnsi="Segoe UI" w:eastAsia="Segoe UI" w:cs="Segoe UI"/>
+                <w:color w:val="595959"/>
+                <w:sz w:val="17"/>
+                <w:szCs w:val="17"/>
+              </w:rPr>
+              <w:t>Scenario</w:t>
+            </w:r>
+          </w:p>
+        </w:tc>
+        <w:tc>
+          <w:tcPr>
+            <w:tcW w:w="3200" w:type="dxa"/>
+            <w:shd w:val="clear" w:color="auto" w:fill="DEEAF6"/>
+            <w:tcMar>
+              <w:top w:w="90" w:type="dxa"/>
+              <w:left w:w="110" w:type="dxa"/>
+              <w:bottom w:w="90" w:type="dxa"/>
+              <w:right w:w="110" w:type="dxa"/>
+            </w:tcMar>
+            <w:vAlign w:val="center"/>
+          </w:tcPr>
+          <w:p>
+            <w:pPr>
+              <w:spacing w:before="40" w:after="40" w:line="252" w:lineRule="auto"/>
+              <w:jc w:val="center"/>
+            </w:pPr>
+            <w:r>
+              <w:rPr>
+                <w:rFonts w:ascii="Microsoft YaHei" w:hAnsi="Microsoft YaHei" w:eastAsia="Microsoft YaHei" w:cs="Microsoft YaHei"/>
+                <w:b/>
+                <w:color w:val="000000"/>
+                <w:sz w:val="20"/>
+                <w:szCs w:val="20"/>
+              </w:rPr>
+              <w:t>痛点</w:t>
+            </w:r>
+          </w:p>
+          <w:p>
+            <w:pPr>
+              <w:spacing w:before="40" w:after="40" w:line="252" w:lineRule="auto"/>
+              <w:jc w:val="center"/>
+            </w:pPr>
+            <w:r>
+              <w:rPr>
+                <w:rFonts w:ascii="Segoe UI" w:hAnsi="Segoe UI" w:eastAsia="Segoe UI" w:cs="Segoe UI"/>
+                <w:color w:val="595959"/>
+                <w:sz w:val="17"/>
+                <w:szCs w:val="17"/>
+              </w:rPr>
+              <w:t xml:space="preserve">Pain point</w:t>
+            </w:r>
+          </w:p>
+        </w:tc>
+        <w:tc>
+          <w:tcPr>
+            <w:tcW w:w="4438" w:type="dxa"/>
+            <w:shd w:val="clear" w:color="auto" w:fill="DEEAF6"/>
+            <w:tcMar>
+              <w:top w:w="90" w:type="dxa"/>
+              <w:left w:w="110" w:type="dxa"/>
+              <w:bottom w:w="90" w:type="dxa"/>
+              <w:right w:w="110" w:type="dxa"/>
+            </w:tcMar>
+            <w:vAlign w:val="center"/>
+          </w:tcPr>
+          <w:p>
+            <w:pPr>
+              <w:spacing w:before="40" w:after="40" w:line="252" w:lineRule="auto"/>
+              <w:jc w:val="center"/>
+            </w:pPr>
+            <w:r>
+              <w:rPr>
+                <w:rFonts w:ascii="Microsoft YaHei" w:hAnsi="Microsoft YaHei" w:eastAsia="Microsoft YaHei" w:cs="Microsoft YaHei"/>
+                <w:b/>
+                <w:color w:val="000000"/>
+                <w:sz w:val="20"/>
+                <w:szCs w:val="20"/>
+              </w:rPr>
+              <w:t xml:space="preserve">Skill 怎么帮你</w:t>
+            </w:r>
+          </w:p>
+          <w:p>
+            <w:pPr>
+              <w:spacing w:before="40" w:after="40" w:line="252" w:lineRule="auto"/>
+              <w:jc w:val="center"/>
+            </w:pPr>
+            <w:r>
+              <w:rPr>
+                <w:rFonts w:ascii="Segoe UI" w:hAnsi="Segoe UI" w:eastAsia="Segoe UI" w:cs="Segoe UI"/>
+                <w:color w:val="595959"/>
+                <w:sz w:val="17"/>
+                <w:szCs w:val="17"/>
+              </w:rPr>
+              <w:t xml:space="preserve">How this skill helps</w:t>
+            </w:r>
+          </w:p>
+        </w:tc>
+      </w:tr>
+      <w:tr>
+        <w:tc>
+          <w:tcPr>
+            <w:tcW w:w="2000" w:type="dxa"/>
+            <w:shd w:val="clear" w:color="auto" w:fill="EDF2F9"/>
+            <w:tcMar>
+              <w:top w:w="90" w:type="dxa"/>
+              <w:left w:w="110" w:type="dxa"/>
+              <w:bottom w:w="90" w:type="dxa"/>
+              <w:right w:w="110" w:type="dxa"/>
+            </w:tcMar>
+            <w:vAlign w:val="center"/>
+          </w:tcPr>
+          <w:p>
+            <w:pPr>
+              <w:spacing w:before="40" w:after="40" w:line="252" w:lineRule="auto"/>
+            </w:pPr>
+            <w:r>
+              <w:rPr>
+                <w:rFonts w:ascii="Microsoft YaHei" w:hAnsi="Microsoft YaHei" w:eastAsia="Microsoft YaHei" w:cs="Microsoft YaHei"/>
+                <w:b/>
+                <w:color w:val="000000"/>
+                <w:sz w:val="19"/>
+                <w:szCs w:val="19"/>
+              </w:rPr>
+              <w:t>电商出海</w:t>
+            </w:r>
+          </w:p>
+          <w:p>
+            <w:pPr>
+              <w:spacing w:before="40" w:after="40" w:line="252" w:lineRule="auto"/>
+            </w:pPr>
+            <w:r>
+              <w:rPr>
+                <w:rFonts w:ascii="Segoe UI" w:hAnsi="Segoe UI" w:eastAsia="Segoe UI" w:cs="Segoe UI"/>
+                <w:color w:val="595959"/>
+                <w:sz w:val="17"/>
+                <w:szCs w:val="17"/>
+              </w:rPr>
+              <w:t xml:space="preserve">Cross-border e-commerce</w:t>
+            </w:r>
+          </w:p>
+        </w:tc>
+        <w:tc>
+          <w:tcPr>
+            <w:tcW w:w="3200" w:type="dxa"/>
+            <w:tcMar>
+              <w:top w:w="90" w:type="dxa"/>
+              <w:left w:w="110" w:type="dxa"/>
+              <w:bottom w:w="90" w:type="dxa"/>
+              <w:right w:w="110" w:type="dxa"/>
+            </w:tcMar>
+            <w:vAlign w:val="center"/>
+          </w:tcPr>
+          <w:p>
+            <w:pPr>
+              <w:spacing w:before="40" w:after="40" w:line="252" w:lineRule="auto"/>
+            </w:pPr>
+            <w:r>
+              <w:rPr>
+                <w:rFonts w:ascii="Microsoft YaHei" w:hAnsi="Microsoft YaHei" w:eastAsia="Microsoft YaHei" w:cs="Microsoft YaHei"/>
+                <w:color w:val="000000"/>
+                <w:sz w:val="18"/>
+                <w:szCs w:val="18"/>
+              </w:rPr>
+              <w:t xml:space="preserve">Alibaba / Made-in-China / 独立站的产品详情页要同时上架英、阿、西、俄、土 5 种语言。设计师做完一版源稿，其余语种全靠复制页面手改，一个产品图册改一周。</w:t>
+            </w:r>
+          </w:p>
+          <w:p>
+            <w:pPr>
+              <w:spacing w:before="40" w:after="40" w:line="252" w:lineRule="auto"/>
+            </w:pPr>
+            <w:r>
+              <w:rPr>
+                <w:rFonts w:ascii="Segoe UI" w:hAnsi="Segoe UI" w:eastAsia="Segoe UI" w:cs="Segoe UI"/>
+                <w:color w:val="595959"/>
+                <w:sz w:val="16"/>
+                <w:szCs w:val="16"/>
+              </w:rPr>
+              <w:t xml:space="preserve">Product detail pages on Alibaba, Made-in-China or a standalone site need 5 languages at once. After one source page is done, the rest are copied and edited by hand — one catalogue takes a week.</w:t>
+            </w:r>
+          </w:p>
+        </w:tc>
+        <w:tc>
+          <w:tcPr>
+            <w:tcW w:w="4438" w:type="dxa"/>
+            <w:tcMar>
+              <w:top w:w="90" w:type="dxa"/>
+              <w:left w:w="110" w:type="dxa"/>
+              <w:bottom w:w="90" w:type="dxa"/>
+              <w:right w:w="110" w:type="dxa"/>
+            </w:tcMar>
+            <w:vAlign w:val="center"/>
+          </w:tcPr>
+          <w:p>
+            <w:pPr>
+              <w:spacing w:before="40" w:after="40" w:line="252" w:lineRule="auto"/>
+            </w:pPr>
+            <w:r>
+              <w:rPr>
+                <w:rFonts w:ascii="Microsoft YaHei" w:hAnsi="Microsoft YaHei" w:eastAsia="Microsoft YaHei" w:cs="Microsoft YaHei"/>
+                <w:color w:val="000000"/>
+                <w:sz w:val="18"/>
+                <w:szCs w:val="18"/>
+              </w:rPr>
+              <w:t xml:space="preserve">一句「把这页翻译成阿拉伯语」→ 扫描全页 → 自动翻译 → 原位写回 → 复扫验收。一个语种从一天缩到几分钟，5 种语种一个下午搞定。</w:t>
+            </w:r>
+          </w:p>
+          <w:p>
+            <w:pPr>
+              <w:spacing w:before="40" w:after="40" w:line="252" w:lineRule="auto"/>
+            </w:pPr>
+            <w:r>
+              <w:rPr>
+                <w:rFonts w:ascii="Segoe UI" w:hAnsi="Segoe UI" w:eastAsia="Segoe UI" w:cs="Segoe UI"/>
+                <w:color w:val="595959"/>
+                <w:sz w:val="16"/>
+                <w:szCs w:val="16"/>
+              </w:rPr>
+              <w:t xml:space="preserve">Say “translate this page into Arabic” → scan → translate → write in place → verify. One language drops from a day to minutes; five languages done in an afternoon.</w:t>
+            </w:r>
+          </w:p>
+        </w:tc>
+      </w:tr>
+      <w:tr>
+        <w:tc>
+          <w:tcPr>
+            <w:tcW w:w="2000" w:type="dxa"/>
+            <w:shd w:val="clear" w:color="auto" w:fill="EDF2F9"/>
+            <w:tcMar>
+              <w:top w:w="90" w:type="dxa"/>
+              <w:left w:w="110" w:type="dxa"/>
+              <w:bottom w:w="90" w:type="dxa"/>
+              <w:right w:w="110" w:type="dxa"/>
+            </w:tcMar>
+            <w:vAlign w:val="center"/>
+          </w:tcPr>
+          <w:p>
+            <w:pPr>
+              <w:spacing w:before="40" w:after="40" w:line="252" w:lineRule="auto"/>
+            </w:pPr>
+            <w:r>
+              <w:rPr>
+                <w:rFonts w:ascii="Microsoft YaHei" w:hAnsi="Microsoft YaHei" w:eastAsia="Microsoft YaHei" w:cs="Microsoft YaHei"/>
+                <w:b/>
+                <w:color w:val="000000"/>
+                <w:sz w:val="19"/>
+                <w:szCs w:val="19"/>
+              </w:rPr>
+              <w:t>多语言产品图册</w:t>
+            </w:r>
+          </w:p>
+          <w:p>
+            <w:pPr>
+              <w:spacing w:before="40" w:after="40" w:line="252" w:lineRule="auto"/>
+            </w:pPr>
+            <w:r>
+              <w:rPr>
+                <w:rFonts w:ascii="Segoe UI" w:hAnsi="Segoe UI" w:eastAsia="Segoe UI" w:cs="Segoe UI"/>
+                <w:color w:val="595959"/>
+                <w:sz w:val="17"/>
+                <w:szCs w:val="17"/>
+              </w:rPr>
+              <w:t xml:space="preserve">Multilingual product catalogues</w:t>
+            </w:r>
+          </w:p>
+        </w:tc>
+        <w:tc>
+          <w:tcPr>
+            <w:tcW w:w="3200" w:type="dxa"/>
+            <w:tcMar>
+              <w:top w:w="90" w:type="dxa"/>
+              <w:left w:w="110" w:type="dxa"/>
+              <w:bottom w:w="90" w:type="dxa"/>
+              <w:right w:w="110" w:type="dxa"/>
+            </w:tcMar>
+            <w:vAlign w:val="center"/>
+          </w:tcPr>
+          <w:p>
+            <w:pPr>
+              <w:spacing w:before="40" w:after="40" w:line="252" w:lineRule="auto"/>
+            </w:pPr>
+            <w:r>
+              <w:rPr>
+                <w:rFonts w:ascii="Microsoft YaHei" w:hAnsi="Microsoft YaHei" w:eastAsia="Microsoft YaHei" w:cs="Microsoft YaHei"/>
+                <w:color w:val="000000"/>
+                <w:sz w:val="18"/>
+                <w:szCs w:val="18"/>
+              </w:rPr>
+              <w:t xml:space="preserve">一本 20 页的产品图册要做 6 种语言版本。型号、参数表、标注尺寸必须原样保留，只有描述性文字翻。手动逐框选中、改字、换字号，一页 50+ 文本框，全册 600+。</w:t>
+            </w:r>
+          </w:p>
+          <w:p>
+            <w:pPr>
+              <w:spacing w:before="40" w:after="40" w:line="252" w:lineRule="auto"/>
+            </w:pPr>
+            <w:r>
+              <w:rPr>
+                <w:rFonts w:ascii="Segoe UI" w:hAnsi="Segoe UI" w:eastAsia="Segoe UI" w:cs="Segoe UI"/>
+                <w:color w:val="595959"/>
+                <w:sz w:val="16"/>
+                <w:szCs w:val="16"/>
+              </w:rPr>
+              <w:t xml:space="preserve">A 20-page catalogue needs 6 language versions. Model numbers, spec tables and dimension annotations must stay untouched — only descriptive text gets translated. Selecting each frame, editing text and resizing by hand means 50+ text boxes per page, 600+ per catalogue.</w:t>
+            </w:r>
+          </w:p>
+        </w:tc>
+        <w:tc>
+          <w:tcPr>
+            <w:tcW w:w="4438" w:type="dxa"/>
+            <w:tcMar>
+              <w:top w:w="90" w:type="dxa"/>
+              <w:left w:w="110" w:type="dxa"/>
+              <w:bottom w:w="90" w:type="dxa"/>
+              <w:right w:w="110" w:type="dxa"/>
+            </w:tcMar>
+            <w:vAlign w:val="center"/>
+          </w:tcPr>
+          <w:p>
+            <w:pPr>
+              <w:spacing w:before="40" w:after="40" w:line="252" w:lineRule="auto"/>
+            </w:pPr>
+            <w:r>
+              <w:rPr>
+                <w:rFonts w:ascii="Microsoft YaHei" w:hAnsi="Microsoft YaHei" w:eastAsia="Microsoft YaHei" w:cs="Microsoft YaHei"/>
+                <w:color w:val="000000"/>
+                <w:sz w:val="18"/>
+                <w:szCs w:val="18"/>
+              </w:rPr>
+              <w:t xml:space="preserve">自动分类「该翻 / 该保留」：型号、尺寸、单位用正则识别后原样跳过，只翻描述性文字。字号 / 字重 / 对齐全部保留，RTL 自动翻转。</w:t>
+            </w:r>
+          </w:p>
+          <w:p>
+            <w:pPr>
+              <w:spacing w:before="40" w:after="40" w:line="252" w:lineRule="auto"/>
+            </w:pPr>
+            <w:r>
+              <w:rPr>
+                <w:rFonts w:ascii="Segoe UI" w:hAnsi="Segoe UI" w:eastAsia="Segoe UI" w:cs="Segoe UI"/>
+                <w:color w:val="595959"/>
+                <w:sz w:val="16"/>
+                <w:szCs w:val="16"/>
+              </w:rPr>
+              <w:t xml:space="preserve">Auto-classifies translate-vs-keep: models, dimensions and units are matched by regex and skipped untouched; only descriptions get translated. Font size, weight and alignment are all preserved; RTL is flipped automatically.</w:t>
+            </w:r>
+          </w:p>
+        </w:tc>
+      </w:tr>
+      <w:tr>
+        <w:tc>
+          <w:tcPr>
+            <w:tcW w:w="2000" w:type="dxa"/>
+            <w:shd w:val="clear" w:color="auto" w:fill="EDF2F9"/>
+            <w:tcMar>
+              <w:top w:w="90" w:type="dxa"/>
+              <w:left w:w="110" w:type="dxa"/>
+              <w:bottom w:w="90" w:type="dxa"/>
+              <w:right w:w="110" w:type="dxa"/>
+            </w:tcMar>
+            <w:vAlign w:val="center"/>
+          </w:tcPr>
+          <w:p>
+            <w:pPr>
+              <w:spacing w:before="40" w:after="40" w:line="252" w:lineRule="auto"/>
+            </w:pPr>
+            <w:r>
+              <w:rPr>
+                <w:rFonts w:ascii="Microsoft YaHei" w:hAnsi="Microsoft YaHei" w:eastAsia="Microsoft YaHei" w:cs="Microsoft YaHei"/>
+                <w:b/>
+                <w:color w:val="000000"/>
+                <w:sz w:val="19"/>
+                <w:szCs w:val="19"/>
+              </w:rPr>
+              <w:t>多语言说明书</w:t>
+            </w:r>
+          </w:p>
+          <w:p>
+            <w:pPr>
+              <w:spacing w:before="40" w:after="40" w:line="252" w:lineRule="auto"/>
+            </w:pPr>
+            <w:r>
+              <w:rPr>
+                <w:rFonts w:ascii="Segoe UI" w:hAnsi="Segoe UI" w:eastAsia="Segoe UI" w:cs="Segoe UI"/>
+                <w:color w:val="595959"/>
+                <w:sz w:val="17"/>
+                <w:szCs w:val="17"/>
+              </w:rPr>
+              <w:t xml:space="preserve">Multilingual manuals</w:t>
+            </w:r>
+          </w:p>
+        </w:tc>
+        <w:tc>
+          <w:tcPr>
+            <w:tcW w:w="3200" w:type="dxa"/>
+            <w:tcMar>
+              <w:top w:w="90" w:type="dxa"/>
+              <w:left w:w="110" w:type="dxa"/>
+              <w:bottom w:w="90" w:type="dxa"/>
+              <w:right w:w="110" w:type="dxa"/>
+            </w:tcMar>
+            <w:vAlign w:val="center"/>
+          </w:tcPr>
+          <w:p>
+            <w:pPr>
+              <w:spacing w:before="40" w:after="40" w:line="252" w:lineRule="auto"/>
+            </w:pPr>
+            <w:r>
+              <w:rPr>
+                <w:rFonts w:ascii="Microsoft YaHei" w:hAnsi="Microsoft YaHei" w:eastAsia="Microsoft YaHei" w:cs="Microsoft YaHei"/>
+                <w:color w:val="000000"/>
+                <w:sz w:val="18"/>
+                <w:szCs w:val="18"/>
+              </w:rPr>
+              <w:t xml:space="preserve">机械设备的安装 / 操作 / 维护说明书通常在 Figma 里排版，每个语种一份。阿拉伯语要从右到左排版，俄语要换西里尔字体，设计师手动搞 RTL 几乎不可能。</w:t>
+            </w:r>
+          </w:p>
+          <w:p>
+            <w:pPr>
+              <w:spacing w:before="40" w:after="40" w:line="252" w:lineRule="auto"/>
+            </w:pPr>
+            <w:r>
+              <w:rPr>
+                <w:rFonts w:ascii="Segoe UI" w:hAnsi="Segoe UI" w:eastAsia="Segoe UI" w:cs="Segoe UI"/>
+                <w:color w:val="595959"/>
+                <w:sz w:val="16"/>
+                <w:szCs w:val="16"/>
+              </w:rPr>
+              <w:t xml:space="preserve">Equipment installation / operation / maintenance manuals are laid out in Figma, one copy per language. Arabic needs right-to-left layout, Russian needs a Cyrillic font — designers can't handle RTL by hand.</w:t>
+            </w:r>
+          </w:p>
+        </w:tc>
+        <w:tc>
+          <w:tcPr>
+            <w:tcW w:w="4438" w:type="dxa"/>
+            <w:tcMar>
+              <w:top w:w="90" w:type="dxa"/>
+              <w:left w:w="110" w:type="dxa"/>
+              <w:bottom w:w="90" w:type="dxa"/>
+              <w:right w:w="110" w:type="dxa"/>
+            </w:tcMar>
+            <w:vAlign w:val="center"/>
+          </w:tcPr>
+          <w:p>
+            <w:pPr>
+              <w:spacing w:before="40" w:after="40" w:line="252" w:lineRule="auto"/>
+            </w:pPr>
+            <w:r>
+              <w:rPr>
+                <w:rFonts w:ascii="Microsoft YaHei" w:hAnsi="Microsoft YaHei" w:eastAsia="Microsoft YaHei" w:cs="Microsoft YaHei"/>
+                <w:color w:val="000000"/>
+                <w:sz w:val="18"/>
+                <w:szCs w:val="18"/>
+              </w:rPr>
+              <w:t xml:space="preserve">RTL LEFT↔RIGHT 自动翻转；CENTRE 保持居中；目标字体 + 字重映射自动填充。写完自动复扫，确认源语言残留为 0。</w:t>
+            </w:r>
+          </w:p>
+          <w:p>
+            <w:pPr>
+              <w:spacing w:before="40" w:after="40" w:line="252" w:lineRule="auto"/>
+            </w:pPr>
+            <w:r>
+              <w:rPr>
+                <w:rFonts w:ascii="Segoe UI" w:hAnsi="Segoe UI" w:eastAsia="Segoe UI" w:cs="Segoe UI"/>
+                <w:color w:val="595959"/>
+                <w:sz w:val="16"/>
+                <w:szCs w:val="16"/>
+              </w:rPr>
+              <w:t xml:space="preserve">RTL LEFT↔RIGHT flipped automatically; CENTRE stays centred; target font and weight mapping are applied automatically. Post-write re-scan confirms zero source-language residue.</w:t>
+            </w:r>
+          </w:p>
+        </w:tc>
+      </w:tr>
+    </w:tbl>
+    <w:p>
+      <w:pPr>
+        <w:spacing w:before="0" w:after="120" w:line="276" w:lineRule="auto"/>
+      </w:pPr>
+    </w:p>
+    <w:p>
+      <w:pPr>
+        <w:spacing w:before="60" w:after="80" w:line="276" w:lineRule="auto"/>
+      </w:pPr>
+      <w:r>
+        <w:rPr>
+          <w:rFonts w:ascii="Microsoft YaHei" w:hAnsi="Microsoft YaHei" w:eastAsia="Microsoft YaHei" w:cs="Microsoft YaHei"/>
+          <w:b/>
+          <w:color w:val="2E5C8A"/>
+          <w:sz w:val="23"/>
+          <w:szCs w:val="23"/>
+        </w:rPr>
+        <w:t>谁在用</w:t>
+      </w:r>
+      <w:r>
+        <w:rPr>
+          <w:rFonts w:ascii="Microsoft YaHei" w:hAnsi="Microsoft YaHei" w:eastAsia="Microsoft YaHei" w:cs="Microsoft YaHei"/>
+          <w:sz w:val="23"/>
+          <w:szCs w:val="23"/>
+        </w:rPr>
+        <w:t xml:space="preserve">    </w:t>
+      </w:r>
+      <w:r>
+        <w:rPr>
+          <w:rFonts w:ascii="Segoe UI" w:hAnsi="Segoe UI" w:eastAsia="Segoe UI" w:cs="Segoe UI"/>
+          <w:b/>
+          <w:color w:val="7F9DB9"/>
+          <w:sz w:val="20"/>
+          <w:szCs w:val="20"/>
+        </w:rPr>
+        <w:t xml:space="preserve">Who is it for</w:t>
+      </w:r>
+    </w:p>
+    <w:p>
+      <w:pPr>
+        <w:spacing w:before="0" w:after="40" w:line="300" w:lineRule="auto"/>
+      </w:pPr>
+      <w:r>
+        <w:rPr>
+          <w:rFonts w:ascii="Microsoft YaHei" w:hAnsi="Microsoft YaHei" w:eastAsia="Microsoft YaHei" w:cs="Microsoft YaHei"/>
+          <w:color w:val="000000"/>
+          <w:sz w:val="21"/>
+          <w:szCs w:val="21"/>
+        </w:rPr>
+        <w:t xml:space="preserve">· 跨境电商运营 / 外贸企业：在 Figma 里做产品图册和详情页，需要多语言上架。</w:t>
+      </w:r>
+    </w:p>
+    <w:p>
+      <w:pPr>
+        <w:spacing w:before="0" w:after="140" w:line="300" w:lineRule="auto"/>
+      </w:pPr>
+      <w:r>
+        <w:rPr>
+          <w:rFonts w:ascii="Segoe UI" w:hAnsi="Segoe UI" w:eastAsia="Segoe UI" w:cs="Segoe UI"/>
+          <w:color w:val="404040"/>
+          <w:sz w:val="19"/>
+          <w:szCs w:val="19"/>
+        </w:rPr>
+        <w:t xml:space="preserve">· Cross-border e-commerce operators / export-trade companies: designing catalogues and detail pages in Figma, needing multilingual listings.</w:t>
+      </w:r>
+    </w:p>
+    <w:p>
+      <w:pPr>
+        <w:spacing w:before="0" w:after="40" w:line="300" w:lineRule="auto"/>
+      </w:pPr>
+      <w:r>
+        <w:rPr>
+          <w:rFonts w:ascii="Microsoft YaHei" w:hAnsi="Microsoft YaHei" w:eastAsia="Microsoft YaHei" w:cs="Microsoft YaHei"/>
+          <w:color w:val="000000"/>
+          <w:sz w:val="21"/>
+          <w:szCs w:val="21"/>
+        </w:rPr>
+        <w:t xml:space="preserve">· 工业制造企业：激光切割机、折弯机、剪板机等设备的安装 / 操作说明书多语种输出。</w:t>
+      </w:r>
+    </w:p>
+    <w:p>
+      <w:pPr>
+        <w:spacing w:before="0" w:after="140" w:line="300" w:lineRule="auto"/>
+      </w:pPr>
+      <w:r>
+        <w:rPr>
+          <w:rFonts w:ascii="Segoe UI" w:hAnsi="Segoe UI" w:eastAsia="Segoe UI" w:cs="Segoe UI"/>
+          <w:color w:val="404040"/>
+          <w:sz w:val="19"/>
+          <w:szCs w:val="19"/>
+        </w:rPr>
+        <w:t xml:space="preserve">· Industrial manufacturers: multilingual installation / operation manuals for laser cutters, press brakes, shears, etc.</w:t>
+      </w:r>
+    </w:p>
+    <w:p>
+      <w:pPr>
+        <w:spacing w:before="0" w:after="40" w:line="300" w:lineRule="auto"/>
+      </w:pPr>
+      <w:r>
+        <w:rPr>
+          <w:rFonts w:ascii="Microsoft YaHei" w:hAnsi="Microsoft YaHei" w:eastAsia="Microsoft YaHei" w:cs="Microsoft YaHei"/>
+          <w:color w:val="000000"/>
+          <w:sz w:val="21"/>
+          <w:szCs w:val="21"/>
+        </w:rPr>
+        <w:t xml:space="preserve">· 本地化团队 / 设计师：需要在 Figma 原稿上直接产出多语种版本，而不是导出到别的工具重排。</w:t>
+      </w:r>
+    </w:p>
+    <w:p>
+      <w:pPr>
+        <w:spacing w:before="0" w:after="200" w:line="300" w:lineRule="auto"/>
+      </w:pPr>
+      <w:r>
+        <w:rPr>
+          <w:rFonts w:ascii="Segoe UI" w:hAnsi="Segoe UI" w:eastAsia="Segoe UI" w:cs="Segoe UI"/>
+          <w:color w:val="404040"/>
+          <w:sz w:val="19"/>
+          <w:szCs w:val="19"/>
+        </w:rPr>
+        <w:t xml:space="preserve">· Localization teams / designers: producing multiple language versions directly on the Figma source, instead of exporting to another tool for re-layout.</w:t>
+      </w:r>
+    </w:p>
+    <w:p>
+      <w:r>
+        <w:br w:type="page"/>
+      </w:r>
+    </w:p>
+    <w:p>
+      <w:pPr>
+        <w:pStyle w:val="Heading1"/>
+        <w:spacing w:before="120" w:after="180" w:line="276" w:lineRule="auto"/>
+      </w:pPr>
+      <w:r>
+        <w:rPr>
+          <w:rFonts w:ascii="Microsoft YaHei" w:hAnsi="Microsoft YaHei" w:eastAsia="Microsoft YaHei" w:cs="Microsoft YaHei"/>
+          <w:b/>
+          <w:color w:val="1F3864"/>
+          <w:sz w:val="30"/>
+          <w:szCs w:val="30"/>
+        </w:rPr>
+        <w:t xml:space="preserve">二、这个 Skill 是什么</w:t>
+      </w:r>
+      <w:r>
+        <w:rPr>
+          <w:rFonts w:ascii="Microsoft YaHei" w:hAnsi="Microsoft YaHei" w:eastAsia="Microsoft YaHei" w:cs="Microsoft YaHei"/>
+          <w:sz w:val="30"/>
+          <w:szCs w:val="30"/>
+        </w:rPr>
+        <w:t xml:space="preserve">    </w:t>
+      </w:r>
+      <w:r>
+        <w:rPr>
+          <w:rFonts w:ascii="Segoe UI" w:hAnsi="Segoe UI" w:eastAsia="Segoe UI" w:cs="Segoe UI"/>
+          <w:b/>
+          <w:color w:val="2E5C8A"/>
+          <w:sz w:val="25"/>
+          <w:szCs w:val="25"/>
+        </w:rPr>
+        <w:t xml:space="preserve">2. What This Skill Is</w:t>
       </w:r>
     </w:p>
     <w:p>
@@ -1569,7 +2355,7 @@
           <w:sz w:val="16"/>
           <w:szCs w:val="16"/>
         </w:rPr>
-        <w:t xml:space="preserve">├── docs/                        # This guide</w:t>
+        <w:t xml:space="preserve">├── docs/                        # This guide (bilingual)</w:t>
       </w:r>
     </w:p>
     <w:p>
@@ -1725,7 +2511,7 @@
           <w:sz w:val="30"/>
           <w:szCs w:val="30"/>
         </w:rPr>
-        <w:t>二、安装（每台电脑只需做一次）</w:t>
+        <w:t>三、安装（每台电脑只需做一次）</w:t>
       </w:r>
       <w:r>
         <w:rPr>
@@ -1743,7 +2529,7 @@
           <w:sz w:val="25"/>
           <w:szCs w:val="25"/>
         </w:rPr>
-        <w:t xml:space="preserve">2. Installation (once per machine)</w:t>
+        <w:t xml:space="preserve">3. Installation (once per machine)</w:t>
       </w:r>
     </w:p>
     <w:p>
@@ -2709,7 +3495,7 @@
           <w:sz w:val="30"/>
           <w:szCs w:val="30"/>
         </w:rPr>
-        <w:t>三、怎么用</w:t>
+        <w:t>四、怎么用</w:t>
       </w:r>
       <w:r>
         <w:rPr>
@@ -2727,7 +3513,7 @@
           <w:sz w:val="25"/>
           <w:szCs w:val="25"/>
         </w:rPr>
-        <w:t xml:space="preserve">3. How to Use</w:t>
+        <w:t xml:space="preserve">4. How to Use</w:t>
       </w:r>
     </w:p>
     <w:p>
@@ -3962,7 +4748,7 @@
           <w:sz w:val="30"/>
           <w:szCs w:val="30"/>
         </w:rPr>
-        <w:t>四、换成你自己的项目（改配置）</w:t>
+        <w:t>五、换成你自己的项目（改配置）</w:t>
       </w:r>
       <w:r>
         <w:rPr>
@@ -3980,7 +4766,7 @@
           <w:sz w:val="25"/>
           <w:szCs w:val="25"/>
         </w:rPr>
-        <w:t xml:space="preserve">4. Adapt It to Your Project (Configuration)</w:t>
+        <w:t xml:space="preserve">5. Adapt It to Your Project (Configuration)</w:t>
       </w:r>
     </w:p>
     <w:p>
@@ -4615,7 +5401,7 @@
           <w:sz w:val="30"/>
           <w:szCs w:val="30"/>
         </w:rPr>
-        <w:t>五、验收标准与问题排查</w:t>
+        <w:t>六、验收标准与问题排查</w:t>
       </w:r>
       <w:r>
         <w:rPr>
@@ -4633,7 +5419,7 @@
           <w:sz w:val="25"/>
           <w:szCs w:val="25"/>
         </w:rPr>
-        <w:t xml:space="preserve">5. Acceptance Criteria &amp; Troubleshooting</w:t>
+        <w:t xml:space="preserve">6. Acceptance Criteria &amp; Troubleshooting</w:t>
       </w:r>
     </w:p>
     <w:p>
@@ -6099,7 +6885,7 @@
           <w:sz w:val="30"/>
           <w:szCs w:val="30"/>
         </w:rPr>
-        <w:t>六、你会拿到什么</w:t>
+        <w:t>七、你会拿到什么</w:t>
       </w:r>
       <w:r>
         <w:rPr>
@@ -6117,7 +6903,7 @@
           <w:sz w:val="25"/>
           <w:szCs w:val="25"/>
         </w:rPr>
-        <w:t xml:space="preserve">6. What You Get</w:t>
+        <w:t xml:space="preserve">7. What You Get</w:t>
       </w:r>
     </w:p>
     <w:tbl>
@@ -6637,7 +7423,7 @@
           <w:sz w:val="18"/>
           <w:szCs w:val="18"/>
         </w:rPr>
-        <w:t xml:space="preserve">MIT License · v1.0 · 2026-09-01</w:t>
+        <w:t xml:space="preserve">MIT License · v2.0 · 2026-09-02</w:t>
       </w:r>
     </w:p>
     <w:p>

</xml_diff>

<commit_message>
Expand use cases + language coverage (v3)
- Add "Study-abroad portfolios" as a fourth scenario (bilingual
  portfolios for university applications / job hunting)
- Remove industry-specific wording (laser cutters, press brakes, etc.)
  from "who is it for" — replace with generic "product teams"
- Expand language table: English / German / Italian / Portuguese added;
  now 5 rows with a dedicated Font column
- Note MiSans VF covers Latin + CJK + Cyrillic out of the box — only
  RTL scripts need Noto Sans Arabic
- Both READMEs (CN/EN) updated with matching tables
</commit_message>
<xml_diff>
--- a/docs/figma-translate-guide-bilingual.docx
+++ b/docs/figma-translate-guide-bilingual.docx
@@ -87,6 +87,22 @@
     </w:p>
     <w:p>
       <w:pPr>
+        <w:spacing w:before="0" w:after="20" w:line="300" w:lineRule="auto"/>
+        <w:jc w:val="center"/>
+      </w:pPr>
+      <w:r>
+        <w:rPr>
+          <w:rFonts w:ascii="Microsoft YaHei" w:hAnsi="Microsoft YaHei" w:eastAsia="Microsoft YaHei" w:cs="Microsoft YaHei"/>
+          <w:b/>
+          <w:color w:val="2E5C8A"/>
+          <w:sz w:val="26"/>
+          <w:szCs w:val="26"/>
+        </w:rPr>
+        <w:t xml:space="preserve">电商出海 · 多语言产品图册 · 多语言说明书 · 留学作品集</w:t>
+      </w:r>
+    </w:p>
+    <w:p>
+      <w:pPr>
         <w:spacing w:before="0" w:after="160" w:line="300" w:lineRule="auto"/>
         <w:jc w:val="center"/>
       </w:pPr>
@@ -97,7 +113,7 @@
           <w:sz w:val="20"/>
           <w:szCs w:val="20"/>
         </w:rPr>
-        <w:t xml:space="preserve">Cross-border e-commerce · Multilingual product catalogues · Multilingual manuals</w:t>
+        <w:t xml:space="preserve">Cross-border e-commerce · Product catalogues · Manuals · Study-abroad portfolios</w:t>
       </w:r>
     </w:p>
     <w:p>
@@ -310,21 +326,21 @@
                 <w:sz w:val="19"/>
                 <w:szCs w:val="19"/>
               </w:rPr>
-              <w:t xml:space="preserve">电商出海团队的 Figma 多语言产品图册、说明书、详情页本地化</w:t>
-            </w:r>
-          </w:p>
-          <w:p>
-            <w:pPr>
-              <w:spacing w:before="40" w:after="40" w:line="252" w:lineRule="auto"/>
-            </w:pPr>
-            <w:r>
-              <w:rPr>
-                <w:rFonts w:ascii="Segoe UI" w:hAnsi="Segoe UI" w:eastAsia="Segoe UI" w:cs="Segoe UI"/>
-                <w:color w:val="595959"/>
-                <w:sz w:val="17"/>
-                <w:szCs w:val="17"/>
-              </w:rPr>
-              <w:t xml:space="preserve">Cross-border e-commerce teams localizing Figma product catalogues, manuals and detail pages into multiple languages.</w:t>
+              <w:t xml:space="preserve">电商出海产品图册 / 产品多语言说明书 / 留学作品集——Figma 多语言本地化</w:t>
+            </w:r>
+          </w:p>
+          <w:p>
+            <w:pPr>
+              <w:spacing w:before="40" w:after="40" w:line="252" w:lineRule="auto"/>
+            </w:pPr>
+            <w:r>
+              <w:rPr>
+                <w:rFonts w:ascii="Segoe UI" w:hAnsi="Segoe UI" w:eastAsia="Segoe UI" w:cs="Segoe UI"/>
+                <w:color w:val="595959"/>
+                <w:sz w:val="17"/>
+                <w:szCs w:val="17"/>
+              </w:rPr>
+              <w:t xml:space="preserve">Cross-border e-commerce catalogues / multilingual product manuals / study-abroad portfolios — Figma localization.</w:t>
             </w:r>
           </w:p>
         </w:tc>
@@ -716,7 +732,7 @@
           <w:sz w:val="21"/>
           <w:szCs w:val="21"/>
         </w:rPr>
-        <w:t xml:space="preserve">这个 Skill 不是通用翻译工具——它专门解决一个真实的痛点：跨境电商 / 工业制造企业在 Figma 里做好了产品图册或说明书的设计稿，需要同时输出阿拉伯语、西班牙语、俄语、土耳其语等多个语言版本。传统做法是设计师把每页复制一份、逐个文本框手动改字，既慢又容易出错，阿拉伯语的 RTL 排版更是几乎没法手动搞定。</w:t>
+        <w:t xml:space="preserve">这个 Skill 不是通用翻译工具——它专门解决一个真实的痛点：跨境电商 / 产品团队 / 留学申请者在 Figma 里做好了产品图册、说明书或作品集的设计稿，需要同时输出阿拉伯语、英语、德语、西班牙语、俄语等多个语言版本。传统做法是设计师把每页复制一份、逐个文本框手动改字，既慢又容易出错，阿拉伯语的 RTL 排版更是几乎没法手动搞定。</w:t>
       </w:r>
     </w:p>
     <w:p>
@@ -730,7 +746,7 @@
           <w:sz w:val="19"/>
           <w:szCs w:val="19"/>
         </w:rPr>
-        <w:t xml:space="preserve">This skill is not a general-purpose translator. It solves one real pain point: cross-border e-commerce and industrial manufacturers who design product catalogues or manuals in Figma and need to output Arabic, Spanish, Russian, Turkish and other language versions simultaneously. The traditional approach — duplicating each page and changing text frame by frame by hand — is slow, error-prone, and nearly impossible for Arabic RTL.</w:t>
+        <w:t xml:space="preserve">This skill is not a general-purpose translator. It solves one real pain point: cross-border e-commerce / product teams / study-abroad applicants who design catalogues, manuals or portfolios in Figma and need to output Arabic, English, German, Spanish, Russian and other language versions simultaneously. The traditional approach — duplicating each page and changing text frame by frame by hand — is slow, error-prone, and nearly impossible for Arabic RTL.</w:t>
       </w:r>
     </w:p>
     <w:p>
@@ -745,7 +761,7 @@
           <w:sz w:val="23"/>
           <w:szCs w:val="23"/>
         </w:rPr>
-        <w:t>三大典型场景</w:t>
+        <w:t>四大典型场景</w:t>
       </w:r>
       <w:r>
         <w:rPr>
@@ -763,7 +779,7 @@
           <w:sz w:val="20"/>
           <w:szCs w:val="20"/>
         </w:rPr>
-        <w:t xml:space="preserve">Three typical scenarios</w:t>
+        <w:t xml:space="preserve">Four typical scenarios</w:t>
       </w:r>
     </w:p>
     <w:tbl>
@@ -1239,7 +1255,7 @@
                 <w:sz w:val="18"/>
                 <w:szCs w:val="18"/>
               </w:rPr>
-              <w:t xml:space="preserve">机械设备的安装 / 操作 / 维护说明书通常在 Figma 里排版，每个语种一份。阿拉伯语要从右到左排版，俄语要换西里尔字体，设计师手动搞 RTL 几乎不可能。</w:t>
+              <w:t xml:space="preserve">产品的安装 / 操作 / 维护说明书在 Figma 里排版，每个语种一份。阿拉伯语要从右到左排版，俄语要换西里尔字体，设计师手动搞 RTL 几乎不可能。</w:t>
             </w:r>
           </w:p>
           <w:p>
@@ -1253,7 +1269,7 @@
                 <w:sz w:val="16"/>
                 <w:szCs w:val="16"/>
               </w:rPr>
-              <w:t xml:space="preserve">Equipment installation / operation / maintenance manuals are laid out in Figma, one copy per language. Arabic needs right-to-left layout, Russian needs a Cyrillic font — designers can't handle RTL by hand.</w:t>
+              <w:t xml:space="preserve">Product installation / operation / maintenance manuals laid out in Figma, one copy per language. Arabic needs right-to-left layout, Russian needs a Cyrillic font — designers can't handle RTL by hand.</w:t>
             </w:r>
           </w:p>
         </w:tc>
@@ -1294,6 +1310,130 @@
                 <w:szCs w:val="16"/>
               </w:rPr>
               <w:t xml:space="preserve">RTL LEFT↔RIGHT flipped automatically; CENTRE stays centred; target font and weight mapping are applied automatically. Post-write re-scan confirms zero source-language residue.</w:t>
+            </w:r>
+          </w:p>
+        </w:tc>
+      </w:tr>
+      <w:tr>
+        <w:tc>
+          <w:tcPr>
+            <w:tcW w:w="2000" w:type="dxa"/>
+            <w:shd w:val="clear" w:color="auto" w:fill="EDF2F9"/>
+            <w:tcMar>
+              <w:top w:w="90" w:type="dxa"/>
+              <w:left w:w="110" w:type="dxa"/>
+              <w:bottom w:w="90" w:type="dxa"/>
+              <w:right w:w="110" w:type="dxa"/>
+            </w:tcMar>
+            <w:vAlign w:val="center"/>
+          </w:tcPr>
+          <w:p>
+            <w:pPr>
+              <w:spacing w:before="40" w:after="40" w:line="252" w:lineRule="auto"/>
+            </w:pPr>
+            <w:r>
+              <w:rPr>
+                <w:rFonts w:ascii="Microsoft YaHei" w:hAnsi="Microsoft YaHei" w:eastAsia="Microsoft YaHei" w:cs="Microsoft YaHei"/>
+                <w:b/>
+                <w:color w:val="000000"/>
+                <w:sz w:val="19"/>
+                <w:szCs w:val="19"/>
+              </w:rPr>
+              <w:t>留学作品集</w:t>
+            </w:r>
+          </w:p>
+          <w:p>
+            <w:pPr>
+              <w:spacing w:before="40" w:after="40" w:line="252" w:lineRule="auto"/>
+            </w:pPr>
+            <w:r>
+              <w:rPr>
+                <w:rFonts w:ascii="Segoe UI" w:hAnsi="Segoe UI" w:eastAsia="Segoe UI" w:cs="Segoe UI"/>
+                <w:color w:val="595959"/>
+                <w:sz w:val="17"/>
+                <w:szCs w:val="17"/>
+              </w:rPr>
+              <w:t xml:space="preserve">Study-abroad portfolios</w:t>
+            </w:r>
+          </w:p>
+        </w:tc>
+        <w:tc>
+          <w:tcPr>
+            <w:tcW w:w="3200" w:type="dxa"/>
+            <w:tcMar>
+              <w:top w:w="90" w:type="dxa"/>
+              <w:left w:w="110" w:type="dxa"/>
+              <w:bottom w:w="90" w:type="dxa"/>
+              <w:right w:w="110" w:type="dxa"/>
+            </w:tcMar>
+            <w:vAlign w:val="center"/>
+          </w:tcPr>
+          <w:p>
+            <w:pPr>
+              <w:spacing w:before="40" w:after="40" w:line="252" w:lineRule="auto"/>
+            </w:pPr>
+            <w:r>
+              <w:rPr>
+                <w:rFonts w:ascii="Microsoft YaHei" w:hAnsi="Microsoft YaHei" w:eastAsia="Microsoft YaHei" w:cs="Microsoft YaHei"/>
+                <w:color w:val="000000"/>
+                <w:sz w:val="18"/>
+                <w:szCs w:val="18"/>
+              </w:rPr>
+              <w:t xml:space="preserve">作品集 / 设计提案在 Figma 排版后需要输出中英双语或多语版本用于升学、求职。手动逐页复制改字，排版细节（字号、行距、对齐）很容易跑偏。</w:t>
+            </w:r>
+          </w:p>
+          <w:p>
+            <w:pPr>
+              <w:spacing w:before="40" w:after="40" w:line="252" w:lineRule="auto"/>
+            </w:pPr>
+            <w:r>
+              <w:rPr>
+                <w:rFonts w:ascii="Segoe UI" w:hAnsi="Segoe UI" w:eastAsia="Segoe UI" w:cs="Segoe UI"/>
+                <w:color w:val="595959"/>
+                <w:sz w:val="16"/>
+                <w:szCs w:val="16"/>
+              </w:rPr>
+              <w:t xml:space="preserve">Portfolios / design proposals laid out in Figma need bilingual or multilingual versions for university applications or job hunting. Copying pages and editing by hand easily breaks typography (font size, line spacing, alignment).</w:t>
+            </w:r>
+          </w:p>
+        </w:tc>
+        <w:tc>
+          <w:tcPr>
+            <w:tcW w:w="4438" w:type="dxa"/>
+            <w:tcMar>
+              <w:top w:w="90" w:type="dxa"/>
+              <w:left w:w="110" w:type="dxa"/>
+              <w:bottom w:w="90" w:type="dxa"/>
+              <w:right w:w="110" w:type="dxa"/>
+            </w:tcMar>
+            <w:vAlign w:val="center"/>
+          </w:tcPr>
+          <w:p>
+            <w:pPr>
+              <w:spacing w:before="40" w:after="40" w:line="252" w:lineRule="auto"/>
+            </w:pPr>
+            <w:r>
+              <w:rPr>
+                <w:rFonts w:ascii="Microsoft YaHei" w:hAnsi="Microsoft YaHei" w:eastAsia="Microsoft YaHei" w:cs="Microsoft YaHei"/>
+                <w:color w:val="000000"/>
+                <w:sz w:val="18"/>
+                <w:szCs w:val="18"/>
+              </w:rPr>
+              <w:t xml:space="preserve">一句指令翻译整页，字体 / 字号 / 字重 / 对齐原样保留，不用手动复制页面逐框改字。MiSans VF 覆盖中英日韩等主流语言，开箱即用。</w:t>
+            </w:r>
+          </w:p>
+          <w:p>
+            <w:pPr>
+              <w:spacing w:before="40" w:after="40" w:line="252" w:lineRule="auto"/>
+            </w:pPr>
+            <w:r>
+              <w:rPr>
+                <w:rFonts w:ascii="Segoe UI" w:hAnsi="Segoe UI" w:eastAsia="Segoe UI" w:cs="Segoe UI"/>
+                <w:color w:val="595959"/>
+                <w:sz w:val="16"/>
+                <w:szCs w:val="16"/>
+              </w:rPr>
+              <w:t xml:space="preserve">One command translates the whole page. Font / size / weight / alignment are preserved — no need to duplicate pages and edit frame by frame. MiSans VF covers Chinese, English, Japanese, Korean and other mainstream languages out of the box.</w:t>
             </w:r>
           </w:p>
         </w:tc>
@@ -1376,7 +1516,7 @@
           <w:sz w:val="21"/>
           <w:szCs w:val="21"/>
         </w:rPr>
-        <w:t xml:space="preserve">· 工业制造企业：激光切割机、折弯机、剪板机等设备的安装 / 操作说明书多语种输出。</w:t>
+        <w:t xml:space="preserve">· 产品团队：任何需要在 Figma 里排版、输出多语种版本的产品说明书。</w:t>
       </w:r>
     </w:p>
     <w:p>
@@ -1390,7 +1530,7 @@
           <w:sz w:val="19"/>
           <w:szCs w:val="19"/>
         </w:rPr>
-        <w:t xml:space="preserve">· Industrial manufacturers: multilingual installation / operation manuals for laser cutters, press brakes, shears, etc.</w:t>
+        <w:t xml:space="preserve">· Product teams: anyone laying out multilingual product manuals in Figma.</w:t>
       </w:r>
     </w:p>
     <w:p>
@@ -1404,12 +1544,12 @@
           <w:sz w:val="21"/>
           <w:szCs w:val="21"/>
         </w:rPr>
-        <w:t xml:space="preserve">· 本地化团队 / 设计师：需要在 Figma 原稿上直接产出多语种版本，而不是导出到别的工具重排。</w:t>
-      </w:r>
-    </w:p>
-    <w:p>
-      <w:pPr>
-        <w:spacing w:before="0" w:after="200" w:line="300" w:lineRule="auto"/>
+        <w:t xml:space="preserve">· 留学申请者 / 设计师：作品集、设计提案需要中英双语或多语版本用于升学、求职。</w:t>
+      </w:r>
+    </w:p>
+    <w:p>
+      <w:pPr>
+        <w:spacing w:before="0" w:after="140" w:line="300" w:lineRule="auto"/>
       </w:pPr>
       <w:r>
         <w:rPr>
@@ -1418,7 +1558,35 @@
           <w:sz w:val="19"/>
           <w:szCs w:val="19"/>
         </w:rPr>
-        <w:t xml:space="preserve">· Localization teams / designers: producing multiple language versions directly on the Figma source, instead of exporting to another tool for re-layout.</w:t>
+        <w:t xml:space="preserve">· Study-abroad applicants / designers: portfolios and proposals needing bilingual or multilingual versions for applications or job hunting.</w:t>
+      </w:r>
+    </w:p>
+    <w:p>
+      <w:pPr>
+        <w:spacing w:before="0" w:after="40" w:line="300" w:lineRule="auto"/>
+      </w:pPr>
+      <w:r>
+        <w:rPr>
+          <w:rFonts w:ascii="Microsoft YaHei" w:hAnsi="Microsoft YaHei" w:eastAsia="Microsoft YaHei" w:cs="Microsoft YaHei"/>
+          <w:color w:val="000000"/>
+          <w:sz w:val="21"/>
+          <w:szCs w:val="21"/>
+        </w:rPr>
+        <w:t xml:space="preserve">· 本地化团队：需要在 Figma 原稿上直接产出多语种版本，而不是导出到别的工具重排。</w:t>
+      </w:r>
+    </w:p>
+    <w:p>
+      <w:pPr>
+        <w:spacing w:before="0" w:after="200" w:line="300" w:lineRule="auto"/>
+      </w:pPr>
+      <w:r>
+        <w:rPr>
+          <w:rFonts w:ascii="Segoe UI" w:hAnsi="Segoe UI" w:eastAsia="Segoe UI" w:cs="Segoe UI"/>
+          <w:color w:val="404040"/>
+          <w:sz w:val="19"/>
+          <w:szCs w:val="19"/>
+        </w:rPr>
+        <w:t xml:space="preserve">· Localization teams: producing multiple language versions directly on the Figma source, instead of exporting to another tool for re-layout.</w:t>
       </w:r>
     </w:p>
     <w:p>
@@ -4191,6 +4359,34 @@
         <w:t xml:space="preserve">Supported languages</w:t>
       </w:r>
     </w:p>
+    <w:p>
+      <w:pPr>
+        <w:spacing w:before="0" w:after="40" w:line="300" w:lineRule="auto"/>
+      </w:pPr>
+      <w:r>
+        <w:rPr>
+          <w:rFonts w:ascii="Microsoft YaHei" w:hAnsi="Microsoft YaHei" w:eastAsia="Microsoft YaHei" w:cs="Microsoft YaHei"/>
+          <w:color w:val="000000"/>
+          <w:sz w:val="21"/>
+          <w:szCs w:val="21"/>
+        </w:rPr>
+        <w:t xml:space="preserve">默认字体 MiSans VF 已覆盖拉丁、中日韩、西里尔等主流语言，无需更换。只有阿拉伯 / 希伯来 / 波斯等 RTL 脚本不含字形，需换成 Figma 内置的 Noto Sans Arabic。</w:t>
+      </w:r>
+    </w:p>
+    <w:p>
+      <w:pPr>
+        <w:spacing w:before="0" w:after="140" w:line="300" w:lineRule="auto"/>
+      </w:pPr>
+      <w:r>
+        <w:rPr>
+          <w:rFonts w:ascii="Segoe UI" w:hAnsi="Segoe UI" w:eastAsia="Segoe UI" w:cs="Segoe UI"/>
+          <w:color w:val="404040"/>
+          <w:sz w:val="19"/>
+          <w:szCs w:val="19"/>
+        </w:rPr>
+        <w:t xml:space="preserve">The default font MiSans VF already covers Latin, CJK and Cyrillic scripts — no font change needed. Only RTL scripts (Arabic / Hebrew / Persian) lack glyphs and must switch to Noto Sans Arabic, built into Figma.</w:t>
+      </w:r>
+    </w:p>
     <w:tbl>
       <w:tblPr>
         <w:tblW w:w="9638" w:type="dxa"/>
@@ -4210,9 +4406,10 @@
         </w:tblCellMar>
       </w:tblPr>
       <w:tblGrid>
+        <w:gridCol w:w="2200"/>
+        <w:gridCol w:w="2000"/>
         <w:gridCol w:w="2400"/>
-        <w:gridCol w:w="2400"/>
-        <w:gridCol w:w="4838"/>
+        <w:gridCol w:w="3038"/>
       </w:tblGrid>
       <w:tr>
         <w:trPr>
@@ -4220,6 +4417,94 @@
         </w:trPr>
         <w:tc>
           <w:tcPr>
+            <w:tcW w:w="2200" w:type="dxa"/>
+            <w:shd w:val="clear" w:color="auto" w:fill="DEEAF6"/>
+            <w:tcMar>
+              <w:top w:w="90" w:type="dxa"/>
+              <w:left w:w="110" w:type="dxa"/>
+              <w:bottom w:w="90" w:type="dxa"/>
+              <w:right w:w="110" w:type="dxa"/>
+            </w:tcMar>
+            <w:vAlign w:val="center"/>
+          </w:tcPr>
+          <w:p>
+            <w:pPr>
+              <w:spacing w:before="40" w:after="40" w:line="252" w:lineRule="auto"/>
+              <w:jc w:val="center"/>
+            </w:pPr>
+            <w:r>
+              <w:rPr>
+                <w:rFonts w:ascii="Microsoft YaHei" w:hAnsi="Microsoft YaHei" w:eastAsia="Microsoft YaHei" w:cs="Microsoft YaHei"/>
+                <w:b/>
+                <w:color w:val="000000"/>
+                <w:sz w:val="20"/>
+                <w:szCs w:val="20"/>
+              </w:rPr>
+              <w:t>目标语言</w:t>
+            </w:r>
+          </w:p>
+          <w:p>
+            <w:pPr>
+              <w:spacing w:before="40" w:after="40" w:line="252" w:lineRule="auto"/>
+              <w:jc w:val="center"/>
+            </w:pPr>
+            <w:r>
+              <w:rPr>
+                <w:rFonts w:ascii="Segoe UI" w:hAnsi="Segoe UI" w:eastAsia="Segoe UI" w:cs="Segoe UI"/>
+                <w:color w:val="595959"/>
+                <w:sz w:val="17"/>
+                <w:szCs w:val="17"/>
+              </w:rPr>
+              <w:t xml:space="preserve">Target language</w:t>
+            </w:r>
+          </w:p>
+        </w:tc>
+        <w:tc>
+          <w:tcPr>
+            <w:tcW w:w="2000" w:type="dxa"/>
+            <w:shd w:val="clear" w:color="auto" w:fill="DEEAF6"/>
+            <w:tcMar>
+              <w:top w:w="90" w:type="dxa"/>
+              <w:left w:w="110" w:type="dxa"/>
+              <w:bottom w:w="90" w:type="dxa"/>
+              <w:right w:w="110" w:type="dxa"/>
+            </w:tcMar>
+            <w:vAlign w:val="center"/>
+          </w:tcPr>
+          <w:p>
+            <w:pPr>
+              <w:spacing w:before="40" w:after="40" w:line="252" w:lineRule="auto"/>
+              <w:jc w:val="center"/>
+            </w:pPr>
+            <w:r>
+              <w:rPr>
+                <w:rFonts w:ascii="Microsoft YaHei" w:hAnsi="Microsoft YaHei" w:eastAsia="Microsoft YaHei" w:cs="Microsoft YaHei"/>
+                <w:b/>
+                <w:color w:val="000000"/>
+                <w:sz w:val="20"/>
+                <w:szCs w:val="20"/>
+              </w:rPr>
+              <w:t>文字方向</w:t>
+            </w:r>
+          </w:p>
+          <w:p>
+            <w:pPr>
+              <w:spacing w:before="40" w:after="40" w:line="252" w:lineRule="auto"/>
+              <w:jc w:val="center"/>
+            </w:pPr>
+            <w:r>
+              <w:rPr>
+                <w:rFonts w:ascii="Segoe UI" w:hAnsi="Segoe UI" w:eastAsia="Segoe UI" w:cs="Segoe UI"/>
+                <w:color w:val="595959"/>
+                <w:sz w:val="17"/>
+                <w:szCs w:val="17"/>
+              </w:rPr>
+              <w:t>Direction</w:t>
+            </w:r>
+          </w:p>
+        </w:tc>
+        <w:tc>
+          <w:tcPr>
             <w:tcW w:w="2400" w:type="dxa"/>
             <w:shd w:val="clear" w:color="auto" w:fill="DEEAF6"/>
             <w:tcMar>
@@ -4243,28 +4528,28 @@
                 <w:sz w:val="20"/>
                 <w:szCs w:val="20"/>
               </w:rPr>
-              <w:t>目标语言</w:t>
-            </w:r>
-          </w:p>
-          <w:p>
-            <w:pPr>
-              <w:spacing w:before="40" w:after="40" w:line="252" w:lineRule="auto"/>
-              <w:jc w:val="center"/>
-            </w:pPr>
-            <w:r>
-              <w:rPr>
-                <w:rFonts w:ascii="Segoe UI" w:hAnsi="Segoe UI" w:eastAsia="Segoe UI" w:cs="Segoe UI"/>
-                <w:color w:val="595959"/>
-                <w:sz w:val="17"/>
-                <w:szCs w:val="17"/>
-              </w:rPr>
-              <w:t xml:space="preserve">Target language</w:t>
-            </w:r>
-          </w:p>
-        </w:tc>
-        <w:tc>
-          <w:tcPr>
-            <w:tcW w:w="2400" w:type="dxa"/>
+              <w:t>字体</w:t>
+            </w:r>
+          </w:p>
+          <w:p>
+            <w:pPr>
+              <w:spacing w:before="40" w:after="40" w:line="252" w:lineRule="auto"/>
+              <w:jc w:val="center"/>
+            </w:pPr>
+            <w:r>
+              <w:rPr>
+                <w:rFonts w:ascii="Segoe UI" w:hAnsi="Segoe UI" w:eastAsia="Segoe UI" w:cs="Segoe UI"/>
+                <w:color w:val="595959"/>
+                <w:sz w:val="17"/>
+                <w:szCs w:val="17"/>
+              </w:rPr>
+              <w:t>Font</w:t>
+            </w:r>
+          </w:p>
+        </w:tc>
+        <w:tc>
+          <w:tcPr>
+            <w:tcW w:w="3038" w:type="dxa"/>
             <w:shd w:val="clear" w:color="auto" w:fill="DEEAF6"/>
             <w:tcMar>
               <w:top w:w="90" w:type="dxa"/>
@@ -4287,66 +4572,22 @@
                 <w:sz w:val="20"/>
                 <w:szCs w:val="20"/>
               </w:rPr>
-              <w:t>文字方向</w:t>
-            </w:r>
-          </w:p>
-          <w:p>
-            <w:pPr>
-              <w:spacing w:before="40" w:after="40" w:line="252" w:lineRule="auto"/>
-              <w:jc w:val="center"/>
-            </w:pPr>
-            <w:r>
-              <w:rPr>
-                <w:rFonts w:ascii="Segoe UI" w:hAnsi="Segoe UI" w:eastAsia="Segoe UI" w:cs="Segoe UI"/>
-                <w:color w:val="595959"/>
-                <w:sz w:val="17"/>
-                <w:szCs w:val="17"/>
-              </w:rPr>
-              <w:t>Direction</w:t>
-            </w:r>
-          </w:p>
-        </w:tc>
-        <w:tc>
-          <w:tcPr>
-            <w:tcW w:w="4838" w:type="dxa"/>
-            <w:shd w:val="clear" w:color="auto" w:fill="DEEAF6"/>
-            <w:tcMar>
-              <w:top w:w="90" w:type="dxa"/>
-              <w:left w:w="110" w:type="dxa"/>
-              <w:bottom w:w="90" w:type="dxa"/>
-              <w:right w:w="110" w:type="dxa"/>
-            </w:tcMar>
-            <w:vAlign w:val="center"/>
-          </w:tcPr>
-          <w:p>
-            <w:pPr>
-              <w:spacing w:before="40" w:after="40" w:line="252" w:lineRule="auto"/>
-              <w:jc w:val="center"/>
-            </w:pPr>
-            <w:r>
-              <w:rPr>
-                <w:rFonts w:ascii="Microsoft YaHei" w:hAnsi="Microsoft YaHei" w:eastAsia="Microsoft YaHei" w:cs="Microsoft YaHei"/>
-                <w:b/>
-                <w:color w:val="000000"/>
-                <w:sz w:val="20"/>
-                <w:szCs w:val="20"/>
-              </w:rPr>
-              <w:t>对齐如何处理</w:t>
-            </w:r>
-          </w:p>
-          <w:p>
-            <w:pPr>
-              <w:spacing w:before="40" w:after="40" w:line="252" w:lineRule="auto"/>
-              <w:jc w:val="center"/>
-            </w:pPr>
-            <w:r>
-              <w:rPr>
-                <w:rFonts w:ascii="Segoe UI" w:hAnsi="Segoe UI" w:eastAsia="Segoe UI" w:cs="Segoe UI"/>
-                <w:color w:val="595959"/>
-                <w:sz w:val="17"/>
-                <w:szCs w:val="17"/>
-              </w:rPr>
-              <w:t xml:space="preserve">How alignment is handled</w:t>
+              <w:t>对齐处理</w:t>
+            </w:r>
+          </w:p>
+          <w:p>
+            <w:pPr>
+              <w:spacing w:before="40" w:after="40" w:line="252" w:lineRule="auto"/>
+              <w:jc w:val="center"/>
+            </w:pPr>
+            <w:r>
+              <w:rPr>
+                <w:rFonts w:ascii="Segoe UI" w:hAnsi="Segoe UI" w:eastAsia="Segoe UI" w:cs="Segoe UI"/>
+                <w:color w:val="595959"/>
+                <w:sz w:val="17"/>
+                <w:szCs w:val="17"/>
+              </w:rPr>
+              <w:t>Alignment</w:t>
             </w:r>
           </w:p>
         </w:tc>
@@ -4354,7 +4595,49 @@
       <w:tr>
         <w:tc>
           <w:tcPr>
-            <w:tcW w:w="2400" w:type="dxa"/>
+            <w:tcW w:w="2200" w:type="dxa"/>
+            <w:tcMar>
+              <w:top w:w="90" w:type="dxa"/>
+              <w:left w:w="110" w:type="dxa"/>
+              <w:bottom w:w="90" w:type="dxa"/>
+              <w:right w:w="110" w:type="dxa"/>
+            </w:tcMar>
+            <w:vAlign w:val="center"/>
+          </w:tcPr>
+          <w:p>
+            <w:pPr>
+              <w:spacing w:before="40" w:after="40" w:line="252" w:lineRule="auto"/>
+              <w:jc w:val="center"/>
+            </w:pPr>
+            <w:r>
+              <w:rPr>
+                <w:rFonts w:ascii="Microsoft YaHei" w:hAnsi="Microsoft YaHei" w:eastAsia="Microsoft YaHei" w:cs="Microsoft YaHei"/>
+                <w:color w:val="000000"/>
+                <w:sz w:val="18"/>
+                <w:szCs w:val="18"/>
+              </w:rPr>
+              <w:t xml:space="preserve">英语 / 德语 / 意大利语 / 葡萄牙语</w:t>
+            </w:r>
+          </w:p>
+          <w:p>
+            <w:pPr>
+              <w:spacing w:before="40" w:after="40" w:line="252" w:lineRule="auto"/>
+              <w:jc w:val="center"/>
+            </w:pPr>
+            <w:r>
+              <w:rPr>
+                <w:rFonts w:ascii="Segoe UI" w:hAnsi="Segoe UI" w:eastAsia="Segoe UI" w:cs="Segoe UI"/>
+                <w:color w:val="595959"/>
+                <w:sz w:val="16"/>
+                <w:szCs w:val="16"/>
+              </w:rPr>
+              <w:t xml:space="preserve">English / German / Italian / Portuguese</w:t>
+            </w:r>
+          </w:p>
+        </w:tc>
+        <w:tc>
+          <w:tcPr>
+            <w:tcW w:w="2000" w:type="dxa"/>
             <w:tcMar>
               <w:top w:w="90" w:type="dxa"/>
               <w:left w:w="110" w:type="dxa"/>
@@ -4375,28 +4658,156 @@
                 <w:sz w:val="19"/>
                 <w:szCs w:val="19"/>
               </w:rPr>
-              <w:t xml:space="preserve">阿拉伯语 / 希伯来语 / 波斯语</w:t>
-            </w:r>
-          </w:p>
-          <w:p>
-            <w:pPr>
-              <w:spacing w:before="40" w:after="40" w:line="252" w:lineRule="auto"/>
-              <w:jc w:val="center"/>
-            </w:pPr>
-            <w:r>
-              <w:rPr>
-                <w:rFonts w:ascii="Segoe UI" w:hAnsi="Segoe UI" w:eastAsia="Segoe UI" w:cs="Segoe UI"/>
-                <w:color w:val="595959"/>
-                <w:sz w:val="17"/>
-                <w:szCs w:val="17"/>
-              </w:rPr>
-              <w:t xml:space="preserve">Arabic / Hebrew / Persian</w:t>
+              <w:t>LTR</w:t>
+            </w:r>
+          </w:p>
+          <w:p>
+            <w:pPr>
+              <w:spacing w:before="40" w:after="40" w:line="252" w:lineRule="auto"/>
+              <w:jc w:val="center"/>
+            </w:pPr>
+            <w:r>
+              <w:rPr>
+                <w:rFonts w:ascii="Segoe UI" w:hAnsi="Segoe UI" w:eastAsia="Segoe UI" w:cs="Segoe UI"/>
+                <w:color w:val="595959"/>
+                <w:sz w:val="17"/>
+                <w:szCs w:val="17"/>
+              </w:rPr>
+              <w:t>LTR</w:t>
             </w:r>
           </w:p>
         </w:tc>
         <w:tc>
           <w:tcPr>
             <w:tcW w:w="2400" w:type="dxa"/>
+            <w:tcMar>
+              <w:top w:w="90" w:type="dxa"/>
+              <w:left w:w="110" w:type="dxa"/>
+              <w:bottom w:w="90" w:type="dxa"/>
+              <w:right w:w="110" w:type="dxa"/>
+            </w:tcMar>
+            <w:vAlign w:val="center"/>
+          </w:tcPr>
+          <w:p>
+            <w:pPr>
+              <w:spacing w:before="40" w:after="40" w:line="252" w:lineRule="auto"/>
+              <w:jc w:val="center"/>
+            </w:pPr>
+            <w:r>
+              <w:rPr>
+                <w:rFonts w:ascii="Microsoft YaHei" w:hAnsi="Microsoft YaHei" w:eastAsia="Microsoft YaHei" w:cs="Microsoft YaHei"/>
+                <w:color w:val="000000"/>
+                <w:sz w:val="18"/>
+                <w:szCs w:val="18"/>
+              </w:rPr>
+              <w:t xml:space="preserve">MiSans VF（原样保留）</w:t>
+            </w:r>
+          </w:p>
+          <w:p>
+            <w:pPr>
+              <w:spacing w:before="40" w:after="40" w:line="252" w:lineRule="auto"/>
+              <w:jc w:val="center"/>
+            </w:pPr>
+            <w:r>
+              <w:rPr>
+                <w:rFonts w:ascii="Segoe UI" w:hAnsi="Segoe UI" w:eastAsia="Segoe UI" w:cs="Segoe UI"/>
+                <w:color w:val="595959"/>
+                <w:sz w:val="16"/>
+                <w:szCs w:val="16"/>
+              </w:rPr>
+              <w:t xml:space="preserve">MiSans VF (kept as-is)</w:t>
+            </w:r>
+          </w:p>
+        </w:tc>
+        <w:tc>
+          <w:tcPr>
+            <w:tcW w:w="3038" w:type="dxa"/>
+            <w:tcMar>
+              <w:top w:w="90" w:type="dxa"/>
+              <w:left w:w="110" w:type="dxa"/>
+              <w:bottom w:w="90" w:type="dxa"/>
+              <w:right w:w="110" w:type="dxa"/>
+            </w:tcMar>
+            <w:vAlign w:val="center"/>
+          </w:tcPr>
+          <w:p>
+            <w:pPr>
+              <w:spacing w:before="40" w:after="40" w:line="252" w:lineRule="auto"/>
+              <w:jc w:val="center"/>
+            </w:pPr>
+            <w:r>
+              <w:rPr>
+                <w:rFonts w:ascii="Microsoft YaHei" w:hAnsi="Microsoft YaHei" w:eastAsia="Microsoft YaHei" w:cs="Microsoft YaHei"/>
+                <w:color w:val="000000"/>
+                <w:sz w:val="18"/>
+                <w:szCs w:val="18"/>
+              </w:rPr>
+              <w:t>沿用原有对齐</w:t>
+            </w:r>
+          </w:p>
+          <w:p>
+            <w:pPr>
+              <w:spacing w:before="40" w:after="40" w:line="252" w:lineRule="auto"/>
+              <w:jc w:val="center"/>
+            </w:pPr>
+            <w:r>
+              <w:rPr>
+                <w:rFonts w:ascii="Segoe UI" w:hAnsi="Segoe UI" w:eastAsia="Segoe UI" w:cs="Segoe UI"/>
+                <w:color w:val="595959"/>
+                <w:sz w:val="16"/>
+                <w:szCs w:val="16"/>
+              </w:rPr>
+              <w:t xml:space="preserve">Keeps original alignment</w:t>
+            </w:r>
+          </w:p>
+        </w:tc>
+      </w:tr>
+      <w:tr>
+        <w:tc>
+          <w:tcPr>
+            <w:tcW w:w="2200" w:type="dxa"/>
+            <w:tcMar>
+              <w:top w:w="90" w:type="dxa"/>
+              <w:left w:w="110" w:type="dxa"/>
+              <w:bottom w:w="90" w:type="dxa"/>
+              <w:right w:w="110" w:type="dxa"/>
+            </w:tcMar>
+            <w:vAlign w:val="center"/>
+          </w:tcPr>
+          <w:p>
+            <w:pPr>
+              <w:spacing w:before="40" w:after="40" w:line="252" w:lineRule="auto"/>
+              <w:jc w:val="center"/>
+            </w:pPr>
+            <w:r>
+              <w:rPr>
+                <w:rFonts w:ascii="Microsoft YaHei" w:hAnsi="Microsoft YaHei" w:eastAsia="Microsoft YaHei" w:cs="Microsoft YaHei"/>
+                <w:color w:val="000000"/>
+                <w:sz w:val="18"/>
+                <w:szCs w:val="18"/>
+              </w:rPr>
+              <w:t xml:space="preserve">法语 / 西班牙语 / 土耳其语</w:t>
+            </w:r>
+          </w:p>
+          <w:p>
+            <w:pPr>
+              <w:spacing w:before="40" w:after="40" w:line="252" w:lineRule="auto"/>
+              <w:jc w:val="center"/>
+            </w:pPr>
+            <w:r>
+              <w:rPr>
+                <w:rFonts w:ascii="Segoe UI" w:hAnsi="Segoe UI" w:eastAsia="Segoe UI" w:cs="Segoe UI"/>
+                <w:color w:val="595959"/>
+                <w:sz w:val="16"/>
+                <w:szCs w:val="16"/>
+              </w:rPr>
+              <w:t xml:space="preserve">French / Spanish / Turkish</w:t>
+            </w:r>
+          </w:p>
+        </w:tc>
+        <w:tc>
+          <w:tcPr>
+            <w:tcW w:w="2000" w:type="dxa"/>
             <w:tcMar>
               <w:top w:w="90" w:type="dxa"/>
               <w:left w:w="110" w:type="dxa"/>
@@ -4417,39 +4828,168 @@
                 <w:sz w:val="19"/>
                 <w:szCs w:val="19"/>
               </w:rPr>
-              <w:t>RTL（从右到左）</w:t>
-            </w:r>
-          </w:p>
-          <w:p>
-            <w:pPr>
-              <w:spacing w:before="40" w:after="40" w:line="252" w:lineRule="auto"/>
-              <w:jc w:val="center"/>
-            </w:pPr>
-            <w:r>
-              <w:rPr>
-                <w:rFonts w:ascii="Segoe UI" w:hAnsi="Segoe UI" w:eastAsia="Segoe UI" w:cs="Segoe UI"/>
-                <w:color w:val="595959"/>
-                <w:sz w:val="17"/>
-                <w:szCs w:val="17"/>
-              </w:rPr>
-              <w:t xml:space="preserve">RTL (right-to-left)</w:t>
-            </w:r>
-          </w:p>
-        </w:tc>
-        <w:tc>
-          <w:tcPr>
-            <w:tcW w:w="4838" w:type="dxa"/>
-            <w:tcMar>
-              <w:top w:w="90" w:type="dxa"/>
-              <w:left w:w="110" w:type="dxa"/>
-              <w:bottom w:w="90" w:type="dxa"/>
-              <w:right w:w="110" w:type="dxa"/>
-            </w:tcMar>
-            <w:vAlign w:val="center"/>
-          </w:tcPr>
-          <w:p>
-            <w:pPr>
-              <w:spacing w:before="40" w:after="40" w:line="252" w:lineRule="auto"/>
+              <w:t>LTR</w:t>
+            </w:r>
+          </w:p>
+          <w:p>
+            <w:pPr>
+              <w:spacing w:before="40" w:after="40" w:line="252" w:lineRule="auto"/>
+              <w:jc w:val="center"/>
+            </w:pPr>
+            <w:r>
+              <w:rPr>
+                <w:rFonts w:ascii="Segoe UI" w:hAnsi="Segoe UI" w:eastAsia="Segoe UI" w:cs="Segoe UI"/>
+                <w:color w:val="595959"/>
+                <w:sz w:val="17"/>
+                <w:szCs w:val="17"/>
+              </w:rPr>
+              <w:t>LTR</w:t>
+            </w:r>
+          </w:p>
+        </w:tc>
+        <w:tc>
+          <w:tcPr>
+            <w:tcW w:w="2400" w:type="dxa"/>
+            <w:tcMar>
+              <w:top w:w="90" w:type="dxa"/>
+              <w:left w:w="110" w:type="dxa"/>
+              <w:bottom w:w="90" w:type="dxa"/>
+              <w:right w:w="110" w:type="dxa"/>
+            </w:tcMar>
+            <w:vAlign w:val="center"/>
+          </w:tcPr>
+          <w:p>
+            <w:pPr>
+              <w:spacing w:before="40" w:after="40" w:line="252" w:lineRule="auto"/>
+              <w:jc w:val="center"/>
+            </w:pPr>
+            <w:r>
+              <w:rPr>
+                <w:rFonts w:ascii="Microsoft YaHei" w:hAnsi="Microsoft YaHei" w:eastAsia="Microsoft YaHei" w:cs="Microsoft YaHei"/>
+                <w:color w:val="000000"/>
+                <w:sz w:val="18"/>
+                <w:szCs w:val="18"/>
+              </w:rPr>
+              <w:t xml:space="preserve">MiSans VF（原样保留）</w:t>
+            </w:r>
+          </w:p>
+          <w:p>
+            <w:pPr>
+              <w:spacing w:before="40" w:after="40" w:line="252" w:lineRule="auto"/>
+              <w:jc w:val="center"/>
+            </w:pPr>
+            <w:r>
+              <w:rPr>
+                <w:rFonts w:ascii="Segoe UI" w:hAnsi="Segoe UI" w:eastAsia="Segoe UI" w:cs="Segoe UI"/>
+                <w:color w:val="595959"/>
+                <w:sz w:val="16"/>
+                <w:szCs w:val="16"/>
+              </w:rPr>
+              <w:t xml:space="preserve">MiSans VF (kept as-is)</w:t>
+            </w:r>
+          </w:p>
+        </w:tc>
+        <w:tc>
+          <w:tcPr>
+            <w:tcW w:w="3038" w:type="dxa"/>
+            <w:tcMar>
+              <w:top w:w="90" w:type="dxa"/>
+              <w:left w:w="110" w:type="dxa"/>
+              <w:bottom w:w="90" w:type="dxa"/>
+              <w:right w:w="110" w:type="dxa"/>
+            </w:tcMar>
+            <w:vAlign w:val="center"/>
+          </w:tcPr>
+          <w:p>
+            <w:pPr>
+              <w:spacing w:before="40" w:after="40" w:line="252" w:lineRule="auto"/>
+              <w:jc w:val="center"/>
+            </w:pPr>
+            <w:r>
+              <w:rPr>
+                <w:rFonts w:ascii="Microsoft YaHei" w:hAnsi="Microsoft YaHei" w:eastAsia="Microsoft YaHei" w:cs="Microsoft YaHei"/>
+                <w:color w:val="000000"/>
+                <w:sz w:val="18"/>
+                <w:szCs w:val="18"/>
+              </w:rPr>
+              <w:t>沿用原有对齐</w:t>
+            </w:r>
+          </w:p>
+          <w:p>
+            <w:pPr>
+              <w:spacing w:before="40" w:after="40" w:line="252" w:lineRule="auto"/>
+              <w:jc w:val="center"/>
+            </w:pPr>
+            <w:r>
+              <w:rPr>
+                <w:rFonts w:ascii="Segoe UI" w:hAnsi="Segoe UI" w:eastAsia="Segoe UI" w:cs="Segoe UI"/>
+                <w:color w:val="595959"/>
+                <w:sz w:val="16"/>
+                <w:szCs w:val="16"/>
+              </w:rPr>
+              <w:t xml:space="preserve">Keeps original alignment</w:t>
+            </w:r>
+          </w:p>
+        </w:tc>
+      </w:tr>
+      <w:tr>
+        <w:tc>
+          <w:tcPr>
+            <w:tcW w:w="2200" w:type="dxa"/>
+            <w:tcMar>
+              <w:top w:w="90" w:type="dxa"/>
+              <w:left w:w="110" w:type="dxa"/>
+              <w:bottom w:w="90" w:type="dxa"/>
+              <w:right w:w="110" w:type="dxa"/>
+            </w:tcMar>
+            <w:vAlign w:val="center"/>
+          </w:tcPr>
+          <w:p>
+            <w:pPr>
+              <w:spacing w:before="40" w:after="40" w:line="252" w:lineRule="auto"/>
+              <w:jc w:val="center"/>
+            </w:pPr>
+            <w:r>
+              <w:rPr>
+                <w:rFonts w:ascii="Microsoft YaHei" w:hAnsi="Microsoft YaHei" w:eastAsia="Microsoft YaHei" w:cs="Microsoft YaHei"/>
+                <w:color w:val="000000"/>
+                <w:sz w:val="18"/>
+                <w:szCs w:val="18"/>
+              </w:rPr>
+              <w:t xml:space="preserve">俄语 / 乌克兰语</w:t>
+            </w:r>
+          </w:p>
+          <w:p>
+            <w:pPr>
+              <w:spacing w:before="40" w:after="40" w:line="252" w:lineRule="auto"/>
+              <w:jc w:val="center"/>
+            </w:pPr>
+            <w:r>
+              <w:rPr>
+                <w:rFonts w:ascii="Segoe UI" w:hAnsi="Segoe UI" w:eastAsia="Segoe UI" w:cs="Segoe UI"/>
+                <w:color w:val="595959"/>
+                <w:sz w:val="16"/>
+                <w:szCs w:val="16"/>
+              </w:rPr>
+              <w:t xml:space="preserve">Russian / Ukrainian</w:t>
+            </w:r>
+          </w:p>
+        </w:tc>
+        <w:tc>
+          <w:tcPr>
+            <w:tcW w:w="2000" w:type="dxa"/>
+            <w:tcMar>
+              <w:top w:w="90" w:type="dxa"/>
+              <w:left w:w="110" w:type="dxa"/>
+              <w:bottom w:w="90" w:type="dxa"/>
+              <w:right w:w="110" w:type="dxa"/>
+            </w:tcMar>
+            <w:vAlign w:val="center"/>
+          </w:tcPr>
+          <w:p>
+            <w:pPr>
+              <w:spacing w:before="40" w:after="40" w:line="252" w:lineRule="auto"/>
+              <w:jc w:val="center"/>
             </w:pPr>
             <w:r>
               <w:rPr>
@@ -4458,21 +4998,106 @@
                 <w:sz w:val="19"/>
                 <w:szCs w:val="19"/>
               </w:rPr>
-              <w:t xml:space="preserve">LEFT ↔ RIGHT 翻转；CENTER、JUSTIFIED 保持不变</w:t>
-            </w:r>
-          </w:p>
-          <w:p>
-            <w:pPr>
-              <w:spacing w:before="40" w:after="40" w:line="252" w:lineRule="auto"/>
-            </w:pPr>
-            <w:r>
-              <w:rPr>
-                <w:rFonts w:ascii="Segoe UI" w:hAnsi="Segoe UI" w:eastAsia="Segoe UI" w:cs="Segoe UI"/>
-                <w:color w:val="595959"/>
-                <w:sz w:val="17"/>
-                <w:szCs w:val="17"/>
-              </w:rPr>
-              <w:t xml:space="preserve">LEFT ↔ RIGHT flipped; CENTER and JUSTIFIED stay as they are</w:t>
+              <w:t>LTR</w:t>
+            </w:r>
+          </w:p>
+          <w:p>
+            <w:pPr>
+              <w:spacing w:before="40" w:after="40" w:line="252" w:lineRule="auto"/>
+              <w:jc w:val="center"/>
+            </w:pPr>
+            <w:r>
+              <w:rPr>
+                <w:rFonts w:ascii="Segoe UI" w:hAnsi="Segoe UI" w:eastAsia="Segoe UI" w:cs="Segoe UI"/>
+                <w:color w:val="595959"/>
+                <w:sz w:val="17"/>
+                <w:szCs w:val="17"/>
+              </w:rPr>
+              <w:t>LTR</w:t>
+            </w:r>
+          </w:p>
+        </w:tc>
+        <w:tc>
+          <w:tcPr>
+            <w:tcW w:w="2400" w:type="dxa"/>
+            <w:tcMar>
+              <w:top w:w="90" w:type="dxa"/>
+              <w:left w:w="110" w:type="dxa"/>
+              <w:bottom w:w="90" w:type="dxa"/>
+              <w:right w:w="110" w:type="dxa"/>
+            </w:tcMar>
+            <w:vAlign w:val="center"/>
+          </w:tcPr>
+          <w:p>
+            <w:pPr>
+              <w:spacing w:before="40" w:after="40" w:line="252" w:lineRule="auto"/>
+              <w:jc w:val="center"/>
+            </w:pPr>
+            <w:r>
+              <w:rPr>
+                <w:rFonts w:ascii="Microsoft YaHei" w:hAnsi="Microsoft YaHei" w:eastAsia="Microsoft YaHei" w:cs="Microsoft YaHei"/>
+                <w:color w:val="000000"/>
+                <w:sz w:val="18"/>
+                <w:szCs w:val="18"/>
+              </w:rPr>
+              <w:t xml:space="preserve">MiSans VF（含西里尔字形）</w:t>
+            </w:r>
+          </w:p>
+          <w:p>
+            <w:pPr>
+              <w:spacing w:before="40" w:after="40" w:line="252" w:lineRule="auto"/>
+              <w:jc w:val="center"/>
+            </w:pPr>
+            <w:r>
+              <w:rPr>
+                <w:rFonts w:ascii="Segoe UI" w:hAnsi="Segoe UI" w:eastAsia="Segoe UI" w:cs="Segoe UI"/>
+                <w:color w:val="595959"/>
+                <w:sz w:val="16"/>
+                <w:szCs w:val="16"/>
+              </w:rPr>
+              <w:t xml:space="preserve">MiSans VF (has Cyrillic)</w:t>
+            </w:r>
+          </w:p>
+        </w:tc>
+        <w:tc>
+          <w:tcPr>
+            <w:tcW w:w="3038" w:type="dxa"/>
+            <w:tcMar>
+              <w:top w:w="90" w:type="dxa"/>
+              <w:left w:w="110" w:type="dxa"/>
+              <w:bottom w:w="90" w:type="dxa"/>
+              <w:right w:w="110" w:type="dxa"/>
+            </w:tcMar>
+            <w:vAlign w:val="center"/>
+          </w:tcPr>
+          <w:p>
+            <w:pPr>
+              <w:spacing w:before="40" w:after="40" w:line="252" w:lineRule="auto"/>
+              <w:jc w:val="center"/>
+            </w:pPr>
+            <w:r>
+              <w:rPr>
+                <w:rFonts w:ascii="Microsoft YaHei" w:hAnsi="Microsoft YaHei" w:eastAsia="Microsoft YaHei" w:cs="Microsoft YaHei"/>
+                <w:color w:val="000000"/>
+                <w:sz w:val="18"/>
+                <w:szCs w:val="18"/>
+              </w:rPr>
+              <w:t>沿用原有对齐</w:t>
+            </w:r>
+          </w:p>
+          <w:p>
+            <w:pPr>
+              <w:spacing w:before="40" w:after="40" w:line="252" w:lineRule="auto"/>
+              <w:jc w:val="center"/>
+            </w:pPr>
+            <w:r>
+              <w:rPr>
+                <w:rFonts w:ascii="Segoe UI" w:hAnsi="Segoe UI" w:eastAsia="Segoe UI" w:cs="Segoe UI"/>
+                <w:color w:val="595959"/>
+                <w:sz w:val="16"/>
+                <w:szCs w:val="16"/>
+              </w:rPr>
+              <w:t xml:space="preserve">Keeps original alignment</w:t>
             </w:r>
           </w:p>
         </w:tc>
@@ -4480,7 +5105,49 @@
       <w:tr>
         <w:tc>
           <w:tcPr>
-            <w:tcW w:w="2400" w:type="dxa"/>
+            <w:tcW w:w="2200" w:type="dxa"/>
+            <w:tcMar>
+              <w:top w:w="90" w:type="dxa"/>
+              <w:left w:w="110" w:type="dxa"/>
+              <w:bottom w:w="90" w:type="dxa"/>
+              <w:right w:w="110" w:type="dxa"/>
+            </w:tcMar>
+            <w:vAlign w:val="center"/>
+          </w:tcPr>
+          <w:p>
+            <w:pPr>
+              <w:spacing w:before="40" w:after="40" w:line="252" w:lineRule="auto"/>
+              <w:jc w:val="center"/>
+            </w:pPr>
+            <w:r>
+              <w:rPr>
+                <w:rFonts w:ascii="Microsoft YaHei" w:hAnsi="Microsoft YaHei" w:eastAsia="Microsoft YaHei" w:cs="Microsoft YaHei"/>
+                <w:color w:val="000000"/>
+                <w:sz w:val="18"/>
+                <w:szCs w:val="18"/>
+              </w:rPr>
+              <w:t xml:space="preserve">中文 / 日文 / 韩文</w:t>
+            </w:r>
+          </w:p>
+          <w:p>
+            <w:pPr>
+              <w:spacing w:before="40" w:after="40" w:line="252" w:lineRule="auto"/>
+              <w:jc w:val="center"/>
+            </w:pPr>
+            <w:r>
+              <w:rPr>
+                <w:rFonts w:ascii="Segoe UI" w:hAnsi="Segoe UI" w:eastAsia="Segoe UI" w:cs="Segoe UI"/>
+                <w:color w:val="595959"/>
+                <w:sz w:val="16"/>
+                <w:szCs w:val="16"/>
+              </w:rPr>
+              <w:t xml:space="preserve">Chinese / Japanese / Korean</w:t>
+            </w:r>
+          </w:p>
+        </w:tc>
+        <w:tc>
+          <w:tcPr>
+            <w:tcW w:w="2000" w:type="dxa"/>
             <w:tcMar>
               <w:top w:w="90" w:type="dxa"/>
               <w:left w:w="110" w:type="dxa"/>
@@ -4501,22 +5168,22 @@
                 <w:sz w:val="19"/>
                 <w:szCs w:val="19"/>
               </w:rPr>
-              <w:t xml:space="preserve">法语 / 西语 / 土耳其语 / 俄语</w:t>
-            </w:r>
-          </w:p>
-          <w:p>
-            <w:pPr>
-              <w:spacing w:before="40" w:after="40" w:line="252" w:lineRule="auto"/>
-              <w:jc w:val="center"/>
-            </w:pPr>
-            <w:r>
-              <w:rPr>
-                <w:rFonts w:ascii="Segoe UI" w:hAnsi="Segoe UI" w:eastAsia="Segoe UI" w:cs="Segoe UI"/>
-                <w:color w:val="595959"/>
-                <w:sz w:val="17"/>
-                <w:szCs w:val="17"/>
-              </w:rPr>
-              <w:t xml:space="preserve">French / Spanish / Turkish / Russian</w:t>
+              <w:t>LTR</w:t>
+            </w:r>
+          </w:p>
+          <w:p>
+            <w:pPr>
+              <w:spacing w:before="40" w:after="40" w:line="252" w:lineRule="auto"/>
+              <w:jc w:val="center"/>
+            </w:pPr>
+            <w:r>
+              <w:rPr>
+                <w:rFonts w:ascii="Segoe UI" w:hAnsi="Segoe UI" w:eastAsia="Segoe UI" w:cs="Segoe UI"/>
+                <w:color w:val="595959"/>
+                <w:sz w:val="17"/>
+                <w:szCs w:val="17"/>
+              </w:rPr>
+              <w:t>LTR</w:t>
             </w:r>
           </w:p>
         </w:tc>
@@ -4540,65 +5207,67 @@
               <w:rPr>
                 <w:rFonts w:ascii="Microsoft YaHei" w:hAnsi="Microsoft YaHei" w:eastAsia="Microsoft YaHei" w:cs="Microsoft YaHei"/>
                 <w:color w:val="000000"/>
-                <w:sz w:val="19"/>
-                <w:szCs w:val="19"/>
-              </w:rPr>
-              <w:t>LTR</w:t>
-            </w:r>
-          </w:p>
-          <w:p>
-            <w:pPr>
-              <w:spacing w:before="40" w:after="40" w:line="252" w:lineRule="auto"/>
-              <w:jc w:val="center"/>
-            </w:pPr>
-            <w:r>
-              <w:rPr>
-                <w:rFonts w:ascii="Segoe UI" w:hAnsi="Segoe UI" w:eastAsia="Segoe UI" w:cs="Segoe UI"/>
-                <w:color w:val="595959"/>
-                <w:sz w:val="17"/>
-                <w:szCs w:val="17"/>
-              </w:rPr>
-              <w:t>LTR</w:t>
-            </w:r>
-          </w:p>
-        </w:tc>
-        <w:tc>
-          <w:tcPr>
-            <w:tcW w:w="4838" w:type="dxa"/>
-            <w:tcMar>
-              <w:top w:w="90" w:type="dxa"/>
-              <w:left w:w="110" w:type="dxa"/>
-              <w:bottom w:w="90" w:type="dxa"/>
-              <w:right w:w="110" w:type="dxa"/>
-            </w:tcMar>
-            <w:vAlign w:val="center"/>
-          </w:tcPr>
-          <w:p>
-            <w:pPr>
-              <w:spacing w:before="40" w:after="40" w:line="252" w:lineRule="auto"/>
-            </w:pPr>
-            <w:r>
-              <w:rPr>
-                <w:rFonts w:ascii="Microsoft YaHei" w:hAnsi="Microsoft YaHei" w:eastAsia="Microsoft YaHei" w:cs="Microsoft YaHei"/>
-                <w:color w:val="000000"/>
-                <w:sz w:val="19"/>
-                <w:szCs w:val="19"/>
-              </w:rPr>
-              <w:t>沿用原有对齐，不做翻转</w:t>
-            </w:r>
-          </w:p>
-          <w:p>
-            <w:pPr>
-              <w:spacing w:before="40" w:after="40" w:line="252" w:lineRule="auto"/>
-            </w:pPr>
-            <w:r>
-              <w:rPr>
-                <w:rFonts w:ascii="Segoe UI" w:hAnsi="Segoe UI" w:eastAsia="Segoe UI" w:cs="Segoe UI"/>
-                <w:color w:val="595959"/>
-                <w:sz w:val="17"/>
-                <w:szCs w:val="17"/>
-              </w:rPr>
-              <w:t xml:space="preserve">Keeps the original alignment, no flip</w:t>
+                <w:sz w:val="18"/>
+                <w:szCs w:val="18"/>
+              </w:rPr>
+              <w:t xml:space="preserve">MiSans VF（含 CJK 字形）</w:t>
+            </w:r>
+          </w:p>
+          <w:p>
+            <w:pPr>
+              <w:spacing w:before="40" w:after="40" w:line="252" w:lineRule="auto"/>
+              <w:jc w:val="center"/>
+            </w:pPr>
+            <w:r>
+              <w:rPr>
+                <w:rFonts w:ascii="Segoe UI" w:hAnsi="Segoe UI" w:eastAsia="Segoe UI" w:cs="Segoe UI"/>
+                <w:color w:val="595959"/>
+                <w:sz w:val="16"/>
+                <w:szCs w:val="16"/>
+              </w:rPr>
+              <w:t xml:space="preserve">MiSans VF (has CJK)</w:t>
+            </w:r>
+          </w:p>
+        </w:tc>
+        <w:tc>
+          <w:tcPr>
+            <w:tcW w:w="3038" w:type="dxa"/>
+            <w:tcMar>
+              <w:top w:w="90" w:type="dxa"/>
+              <w:left w:w="110" w:type="dxa"/>
+              <w:bottom w:w="90" w:type="dxa"/>
+              <w:right w:w="110" w:type="dxa"/>
+            </w:tcMar>
+            <w:vAlign w:val="center"/>
+          </w:tcPr>
+          <w:p>
+            <w:pPr>
+              <w:spacing w:before="40" w:after="40" w:line="252" w:lineRule="auto"/>
+              <w:jc w:val="center"/>
+            </w:pPr>
+            <w:r>
+              <w:rPr>
+                <w:rFonts w:ascii="Microsoft YaHei" w:hAnsi="Microsoft YaHei" w:eastAsia="Microsoft YaHei" w:cs="Microsoft YaHei"/>
+                <w:color w:val="000000"/>
+                <w:sz w:val="18"/>
+                <w:szCs w:val="18"/>
+              </w:rPr>
+              <w:t>沿用原有对齐</w:t>
+            </w:r>
+          </w:p>
+          <w:p>
+            <w:pPr>
+              <w:spacing w:before="40" w:after="40" w:line="252" w:lineRule="auto"/>
+              <w:jc w:val="center"/>
+            </w:pPr>
+            <w:r>
+              <w:rPr>
+                <w:rFonts w:ascii="Segoe UI" w:hAnsi="Segoe UI" w:eastAsia="Segoe UI" w:cs="Segoe UI"/>
+                <w:color w:val="595959"/>
+                <w:sz w:val="16"/>
+                <w:szCs w:val="16"/>
+              </w:rPr>
+              <w:t xml:space="preserve">Keeps original alignment</w:t>
             </w:r>
           </w:p>
         </w:tc>
@@ -4606,6 +5275,90 @@
       <w:tr>
         <w:tc>
           <w:tcPr>
+            <w:tcW w:w="2200" w:type="dxa"/>
+            <w:tcMar>
+              <w:top w:w="90" w:type="dxa"/>
+              <w:left w:w="110" w:type="dxa"/>
+              <w:bottom w:w="90" w:type="dxa"/>
+              <w:right w:w="110" w:type="dxa"/>
+            </w:tcMar>
+            <w:vAlign w:val="center"/>
+          </w:tcPr>
+          <w:p>
+            <w:pPr>
+              <w:spacing w:before="40" w:after="40" w:line="252" w:lineRule="auto"/>
+              <w:jc w:val="center"/>
+            </w:pPr>
+            <w:r>
+              <w:rPr>
+                <w:rFonts w:ascii="Microsoft YaHei" w:hAnsi="Microsoft YaHei" w:eastAsia="Microsoft YaHei" w:cs="Microsoft YaHei"/>
+                <w:color w:val="000000"/>
+                <w:sz w:val="18"/>
+                <w:szCs w:val="18"/>
+              </w:rPr>
+              <w:t xml:space="preserve">阿拉伯语 / 希伯来语 / 波斯语</w:t>
+            </w:r>
+          </w:p>
+          <w:p>
+            <w:pPr>
+              <w:spacing w:before="40" w:after="40" w:line="252" w:lineRule="auto"/>
+              <w:jc w:val="center"/>
+            </w:pPr>
+            <w:r>
+              <w:rPr>
+                <w:rFonts w:ascii="Segoe UI" w:hAnsi="Segoe UI" w:eastAsia="Segoe UI" w:cs="Segoe UI"/>
+                <w:color w:val="595959"/>
+                <w:sz w:val="16"/>
+                <w:szCs w:val="16"/>
+              </w:rPr>
+              <w:t xml:space="preserve">Arabic / Hebrew / Persian</w:t>
+            </w:r>
+          </w:p>
+        </w:tc>
+        <w:tc>
+          <w:tcPr>
+            <w:tcW w:w="2000" w:type="dxa"/>
+            <w:tcMar>
+              <w:top w:w="90" w:type="dxa"/>
+              <w:left w:w="110" w:type="dxa"/>
+              <w:bottom w:w="90" w:type="dxa"/>
+              <w:right w:w="110" w:type="dxa"/>
+            </w:tcMar>
+            <w:vAlign w:val="center"/>
+          </w:tcPr>
+          <w:p>
+            <w:pPr>
+              <w:spacing w:before="40" w:after="40" w:line="252" w:lineRule="auto"/>
+              <w:jc w:val="center"/>
+            </w:pPr>
+            <w:r>
+              <w:rPr>
+                <w:rFonts w:ascii="Microsoft YaHei" w:hAnsi="Microsoft YaHei" w:eastAsia="Microsoft YaHei" w:cs="Microsoft YaHei"/>
+                <w:color w:val="000000"/>
+                <w:sz w:val="18"/>
+                <w:szCs w:val="18"/>
+              </w:rPr>
+              <w:t>RTL（从右到左）</w:t>
+            </w:r>
+          </w:p>
+          <w:p>
+            <w:pPr>
+              <w:spacing w:before="40" w:after="40" w:line="252" w:lineRule="auto"/>
+              <w:jc w:val="center"/>
+            </w:pPr>
+            <w:r>
+              <w:rPr>
+                <w:rFonts w:ascii="Segoe UI" w:hAnsi="Segoe UI" w:eastAsia="Segoe UI" w:cs="Segoe UI"/>
+                <w:color w:val="595959"/>
+                <w:sz w:val="16"/>
+                <w:szCs w:val="16"/>
+              </w:rPr>
+              <w:t xml:space="preserve">RTL (right-to-left)</w:t>
+            </w:r>
+          </w:p>
+        </w:tc>
+        <w:tc>
+          <w:tcPr>
             <w:tcW w:w="2400" w:type="dxa"/>
             <w:tcMar>
               <w:top w:w="90" w:type="dxa"/>
@@ -4624,107 +5377,67 @@
               <w:rPr>
                 <w:rFonts w:ascii="Microsoft YaHei" w:hAnsi="Microsoft YaHei" w:eastAsia="Microsoft YaHei" w:cs="Microsoft YaHei"/>
                 <w:color w:val="000000"/>
-                <w:sz w:val="19"/>
-                <w:szCs w:val="19"/>
-              </w:rPr>
-              <w:t xml:space="preserve">中文 / 日文</w:t>
-            </w:r>
-          </w:p>
-          <w:p>
-            <w:pPr>
-              <w:spacing w:before="40" w:after="40" w:line="252" w:lineRule="auto"/>
-              <w:jc w:val="center"/>
-            </w:pPr>
-            <w:r>
-              <w:rPr>
-                <w:rFonts w:ascii="Segoe UI" w:hAnsi="Segoe UI" w:eastAsia="Segoe UI" w:cs="Segoe UI"/>
-                <w:color w:val="595959"/>
-                <w:sz w:val="17"/>
-                <w:szCs w:val="17"/>
-              </w:rPr>
-              <w:t xml:space="preserve">Chinese / Japanese</w:t>
-            </w:r>
-          </w:p>
-        </w:tc>
-        <w:tc>
-          <w:tcPr>
-            <w:tcW w:w="2400" w:type="dxa"/>
-            <w:tcMar>
-              <w:top w:w="90" w:type="dxa"/>
-              <w:left w:w="110" w:type="dxa"/>
-              <w:bottom w:w="90" w:type="dxa"/>
-              <w:right w:w="110" w:type="dxa"/>
-            </w:tcMar>
-            <w:vAlign w:val="center"/>
-          </w:tcPr>
-          <w:p>
-            <w:pPr>
-              <w:spacing w:before="40" w:after="40" w:line="252" w:lineRule="auto"/>
-              <w:jc w:val="center"/>
-            </w:pPr>
-            <w:r>
-              <w:rPr>
-                <w:rFonts w:ascii="Microsoft YaHei" w:hAnsi="Microsoft YaHei" w:eastAsia="Microsoft YaHei" w:cs="Microsoft YaHei"/>
-                <w:color w:val="000000"/>
-                <w:sz w:val="19"/>
-                <w:szCs w:val="19"/>
-              </w:rPr>
-              <w:t>LTR</w:t>
-            </w:r>
-          </w:p>
-          <w:p>
-            <w:pPr>
-              <w:spacing w:before="40" w:after="40" w:line="252" w:lineRule="auto"/>
-              <w:jc w:val="center"/>
-            </w:pPr>
-            <w:r>
-              <w:rPr>
-                <w:rFonts w:ascii="Segoe UI" w:hAnsi="Segoe UI" w:eastAsia="Segoe UI" w:cs="Segoe UI"/>
-                <w:color w:val="595959"/>
-                <w:sz w:val="17"/>
-                <w:szCs w:val="17"/>
-              </w:rPr>
-              <w:t>LTR</w:t>
-            </w:r>
-          </w:p>
-        </w:tc>
-        <w:tc>
-          <w:tcPr>
-            <w:tcW w:w="4838" w:type="dxa"/>
-            <w:tcMar>
-              <w:top w:w="90" w:type="dxa"/>
-              <w:left w:w="110" w:type="dxa"/>
-              <w:bottom w:w="90" w:type="dxa"/>
-              <w:right w:w="110" w:type="dxa"/>
-            </w:tcMar>
-            <w:vAlign w:val="center"/>
-          </w:tcPr>
-          <w:p>
-            <w:pPr>
-              <w:spacing w:before="40" w:after="40" w:line="252" w:lineRule="auto"/>
-            </w:pPr>
-            <w:r>
-              <w:rPr>
-                <w:rFonts w:ascii="Microsoft YaHei" w:hAnsi="Microsoft YaHei" w:eastAsia="Microsoft YaHei" w:cs="Microsoft YaHei"/>
-                <w:color w:val="000000"/>
-                <w:sz w:val="19"/>
-                <w:szCs w:val="19"/>
-              </w:rPr>
-              <w:t>沿用原有对齐，不做翻转</w:t>
-            </w:r>
-          </w:p>
-          <w:p>
-            <w:pPr>
-              <w:spacing w:before="40" w:after="40" w:line="252" w:lineRule="auto"/>
-            </w:pPr>
-            <w:r>
-              <w:rPr>
-                <w:rFonts w:ascii="Segoe UI" w:hAnsi="Segoe UI" w:eastAsia="Segoe UI" w:cs="Segoe UI"/>
-                <w:color w:val="595959"/>
-                <w:sz w:val="17"/>
-                <w:szCs w:val="17"/>
-              </w:rPr>
-              <w:t xml:space="preserve">Keeps the original alignment, no flip</w:t>
+                <w:sz w:val="18"/>
+                <w:szCs w:val="18"/>
+              </w:rPr>
+              <w:t xml:space="preserve">Noto Sans Arabic（Figma 内置）</w:t>
+            </w:r>
+          </w:p>
+          <w:p>
+            <w:pPr>
+              <w:spacing w:before="40" w:after="40" w:line="252" w:lineRule="auto"/>
+              <w:jc w:val="center"/>
+            </w:pPr>
+            <w:r>
+              <w:rPr>
+                <w:rFonts w:ascii="Segoe UI" w:hAnsi="Segoe UI" w:eastAsia="Segoe UI" w:cs="Segoe UI"/>
+                <w:color w:val="595959"/>
+                <w:sz w:val="16"/>
+                <w:szCs w:val="16"/>
+              </w:rPr>
+              <w:t xml:space="preserve">Noto Sans Arabic (built into Figma)</w:t>
+            </w:r>
+          </w:p>
+        </w:tc>
+        <w:tc>
+          <w:tcPr>
+            <w:tcW w:w="3038" w:type="dxa"/>
+            <w:tcMar>
+              <w:top w:w="90" w:type="dxa"/>
+              <w:left w:w="110" w:type="dxa"/>
+              <w:bottom w:w="90" w:type="dxa"/>
+              <w:right w:w="110" w:type="dxa"/>
+            </w:tcMar>
+            <w:vAlign w:val="center"/>
+          </w:tcPr>
+          <w:p>
+            <w:pPr>
+              <w:spacing w:before="40" w:after="40" w:line="252" w:lineRule="auto"/>
+              <w:jc w:val="center"/>
+            </w:pPr>
+            <w:r>
+              <w:rPr>
+                <w:rFonts w:ascii="Microsoft YaHei" w:hAnsi="Microsoft YaHei" w:eastAsia="Microsoft YaHei" w:cs="Microsoft YaHei"/>
+                <w:color w:val="000000"/>
+                <w:sz w:val="18"/>
+                <w:szCs w:val="18"/>
+              </w:rPr>
+              <w:t xml:space="preserve">LEFT ↔ RIGHT 翻转；CENTER 不变</w:t>
+            </w:r>
+          </w:p>
+          <w:p>
+            <w:pPr>
+              <w:spacing w:before="40" w:after="40" w:line="252" w:lineRule="auto"/>
+              <w:jc w:val="center"/>
+            </w:pPr>
+            <w:r>
+              <w:rPr>
+                <w:rFonts w:ascii="Segoe UI" w:hAnsi="Segoe UI" w:eastAsia="Segoe UI" w:cs="Segoe UI"/>
+                <w:color w:val="595959"/>
+                <w:sz w:val="16"/>
+                <w:szCs w:val="16"/>
+              </w:rPr>
+              <w:t xml:space="preserve">LEFT ↔ RIGHT flipped; CENTER unchanged</w:t>
             </w:r>
           </w:p>
         </w:tc>

</xml_diff>

<commit_message>
Add "Compatible AI agents" section (bilingual, v3.1)
The bridge is a standard MCP stdio server — it works with any agent
that supports MCP, not just WorkBuddy. New section lists 8 agents
(WorkBuddy, Claude Desktop, Cursor, Codex CLI, Cline, Coze, Qwen
Code, Doubao/other) with MCP support status and config location for
each.

Updated in: bilingual docx (now 11 tables), README.md, README_EN.md.
</commit_message>
<xml_diff>
--- a/docs/figma-translate-guide-bilingual.docx
+++ b/docs/figma-translate-guide-bilingual.docx
@@ -662,21 +662,21 @@
                 <w:sz w:val="19"/>
                 <w:szCs w:val="19"/>
               </w:rPr>
-              <w:t xml:space="preserve">v2.0 · 2026-09-02 · MIT 开源</w:t>
-            </w:r>
-          </w:p>
-          <w:p>
-            <w:pPr>
-              <w:spacing w:before="40" w:after="40" w:line="252" w:lineRule="auto"/>
-            </w:pPr>
-            <w:r>
-              <w:rPr>
-                <w:rFonts w:ascii="Segoe UI" w:hAnsi="Segoe UI" w:eastAsia="Segoe UI" w:cs="Segoe UI"/>
-                <w:color w:val="595959"/>
-                <w:sz w:val="17"/>
-                <w:szCs w:val="17"/>
-              </w:rPr>
-              <w:t xml:space="preserve">v2.0 · 2026-09-02 · MIT licensed</w:t>
+              <w:t xml:space="preserve">v3.1 · 2026-09-02 · MIT 开源</w:t>
+            </w:r>
+          </w:p>
+          <w:p>
+            <w:pPr>
+              <w:spacing w:before="40" w:after="40" w:line="252" w:lineRule="auto"/>
+            </w:pPr>
+            <w:r>
+              <w:rPr>
+                <w:rFonts w:ascii="Segoe UI" w:hAnsi="Segoe UI" w:eastAsia="Segoe UI" w:cs="Segoe UI"/>
+                <w:color w:val="595959"/>
+                <w:sz w:val="17"/>
+                <w:szCs w:val="17"/>
+              </w:rPr>
+              <w:t xml:space="preserve">v3.1 · 2026-09-02 · MIT licensed</w:t>
             </w:r>
           </w:p>
         </w:tc>
@@ -5443,6 +5443,1273 @@
         </w:tc>
       </w:tr>
     </w:tbl>
+    <w:p>
+      <w:r>
+        <w:br w:type="page"/>
+      </w:r>
+    </w:p>
+    <w:p>
+      <w:pPr>
+        <w:pStyle w:val="Heading1"/>
+        <w:spacing w:before="120" w:after="180" w:line="276" w:lineRule="auto"/>
+      </w:pPr>
+      <w:r>
+        <w:rPr>
+          <w:rFonts w:ascii="Microsoft YaHei" w:hAnsi="Microsoft YaHei" w:eastAsia="Microsoft YaHei" w:cs="Microsoft YaHei"/>
+          <w:b/>
+          <w:color w:val="1F3864"/>
+          <w:sz w:val="30"/>
+          <w:szCs w:val="30"/>
+        </w:rPr>
+        <w:t xml:space="preserve">四-B、兼容哪些 AI Agent</w:t>
+      </w:r>
+      <w:r>
+        <w:rPr>
+          <w:rFonts w:ascii="Microsoft YaHei" w:hAnsi="Microsoft YaHei" w:eastAsia="Microsoft YaHei" w:cs="Microsoft YaHei"/>
+          <w:sz w:val="30"/>
+          <w:szCs w:val="30"/>
+        </w:rPr>
+        <w:t xml:space="preserve">    </w:t>
+      </w:r>
+      <w:r>
+        <w:rPr>
+          <w:rFonts w:ascii="Segoe UI" w:hAnsi="Segoe UI" w:eastAsia="Segoe UI" w:cs="Segoe UI"/>
+          <w:b/>
+          <w:color w:val="2E5C8A"/>
+          <w:sz w:val="25"/>
+          <w:szCs w:val="25"/>
+        </w:rPr>
+        <w:t xml:space="preserve">4-B. Compatible AI Agents</w:t>
+      </w:r>
+    </w:p>
+    <w:p>
+      <w:pPr>
+        <w:spacing w:before="0" w:after="40" w:line="300" w:lineRule="auto"/>
+      </w:pPr>
+      <w:r>
+        <w:rPr>
+          <w:rFonts w:ascii="Microsoft YaHei" w:hAnsi="Microsoft YaHei" w:eastAsia="Microsoft YaHei" w:cs="Microsoft YaHei"/>
+          <w:color w:val="000000"/>
+          <w:sz w:val="21"/>
+          <w:szCs w:val="21"/>
+        </w:rPr>
+        <w:t xml:space="preserve">本 Skill 的核心是一座 MCP（Model Context Protocol）stdio 服务端——MCP 是 Anthropic 开源的通用协议标准，不绑定 WorkBuddy。任何支持 MCP 的 Agent 都能接入，配置方式一样：在 Agent 的 MCP 配置里注册 figma-write 服务端即可。</w:t>
+      </w:r>
+    </w:p>
+    <w:p>
+      <w:pPr>
+        <w:spacing w:before="0" w:after="140" w:line="300" w:lineRule="auto"/>
+      </w:pPr>
+      <w:r>
+        <w:rPr>
+          <w:rFonts w:ascii="Segoe UI" w:hAnsi="Segoe UI" w:eastAsia="Segoe UI" w:cs="Segoe UI"/>
+          <w:color w:val="404040"/>
+          <w:sz w:val="19"/>
+          <w:szCs w:val="19"/>
+        </w:rPr>
+        <w:t xml:space="preserve">The bridge is a standard MCP (Model Context Protocol) stdio server — MCP is an open standard created by Anthropic, not tied to WorkBuddy. Any agent that supports MCP can connect; the setup is identical: register `figma-write` in the agent's MCP config.</w:t>
+      </w:r>
+    </w:p>
+    <w:tbl>
+      <w:tblPr>
+        <w:tblW w:w="9638" w:type="dxa"/>
+        <w:tblBorders>
+          <w:top w:val="single" w:sz="4" w:space="0" w:color="BFBFBF"/>
+          <w:left w:val="single" w:sz="4" w:space="0" w:color="BFBFBF"/>
+          <w:bottom w:val="single" w:sz="4" w:space="0" w:color="BFBFBF"/>
+          <w:right w:val="single" w:sz="4" w:space="0" w:color="BFBFBF"/>
+          <w:insideH w:val="single" w:sz="4" w:space="0" w:color="BFBFBF"/>
+          <w:insideV w:val="single" w:sz="4" w:space="0" w:color="BFBFBF"/>
+        </w:tblBorders>
+        <w:tblCellMar>
+          <w:top w:w="0" w:type="dxa"/>
+          <w:left w:w="0" w:type="dxa"/>
+          <w:bottom w:w="0" w:type="dxa"/>
+          <w:right w:w="0" w:type="dxa"/>
+        </w:tblCellMar>
+      </w:tblPr>
+      <w:tblGrid>
+        <w:gridCol w:w="2200"/>
+        <w:gridCol w:w="1600"/>
+        <w:gridCol w:w="5838"/>
+      </w:tblGrid>
+      <w:tr>
+        <w:trPr>
+          <w:tblHeader/>
+        </w:trPr>
+        <w:tc>
+          <w:tcPr>
+            <w:tcW w:w="2200" w:type="dxa"/>
+            <w:shd w:val="clear" w:color="auto" w:fill="DEEAF6"/>
+            <w:tcMar>
+              <w:top w:w="90" w:type="dxa"/>
+              <w:left w:w="110" w:type="dxa"/>
+              <w:bottom w:w="90" w:type="dxa"/>
+              <w:right w:w="110" w:type="dxa"/>
+            </w:tcMar>
+            <w:vAlign w:val="center"/>
+          </w:tcPr>
+          <w:p>
+            <w:pPr>
+              <w:spacing w:before="40" w:after="40" w:line="252" w:lineRule="auto"/>
+              <w:jc w:val="center"/>
+            </w:pPr>
+            <w:r>
+              <w:rPr>
+                <w:rFonts w:ascii="Microsoft YaHei" w:hAnsi="Microsoft YaHei" w:eastAsia="Microsoft YaHei" w:cs="Microsoft YaHei"/>
+                <w:b/>
+                <w:color w:val="000000"/>
+                <w:sz w:val="20"/>
+                <w:szCs w:val="20"/>
+              </w:rPr>
+              <w:t>Agent</w:t>
+            </w:r>
+          </w:p>
+          <w:p>
+            <w:pPr>
+              <w:spacing w:before="40" w:after="40" w:line="252" w:lineRule="auto"/>
+              <w:jc w:val="center"/>
+            </w:pPr>
+            <w:r>
+              <w:rPr>
+                <w:rFonts w:ascii="Segoe UI" w:hAnsi="Segoe UI" w:eastAsia="Segoe UI" w:cs="Segoe UI"/>
+                <w:color w:val="595959"/>
+                <w:sz w:val="17"/>
+                <w:szCs w:val="17"/>
+              </w:rPr>
+              <w:t>Agent</w:t>
+            </w:r>
+          </w:p>
+        </w:tc>
+        <w:tc>
+          <w:tcPr>
+            <w:tcW w:w="1600" w:type="dxa"/>
+            <w:shd w:val="clear" w:color="auto" w:fill="DEEAF6"/>
+            <w:tcMar>
+              <w:top w:w="90" w:type="dxa"/>
+              <w:left w:w="110" w:type="dxa"/>
+              <w:bottom w:w="90" w:type="dxa"/>
+              <w:right w:w="110" w:type="dxa"/>
+            </w:tcMar>
+            <w:vAlign w:val="center"/>
+          </w:tcPr>
+          <w:p>
+            <w:pPr>
+              <w:spacing w:before="40" w:after="40" w:line="252" w:lineRule="auto"/>
+              <w:jc w:val="center"/>
+            </w:pPr>
+            <w:r>
+              <w:rPr>
+                <w:rFonts w:ascii="Microsoft YaHei" w:hAnsi="Microsoft YaHei" w:eastAsia="Microsoft YaHei" w:cs="Microsoft YaHei"/>
+                <w:b/>
+                <w:color w:val="000000"/>
+                <w:sz w:val="20"/>
+                <w:szCs w:val="20"/>
+              </w:rPr>
+              <w:t xml:space="preserve">支持 MCP</w:t>
+            </w:r>
+          </w:p>
+          <w:p>
+            <w:pPr>
+              <w:spacing w:before="40" w:after="40" w:line="252" w:lineRule="auto"/>
+              <w:jc w:val="center"/>
+            </w:pPr>
+            <w:r>
+              <w:rPr>
+                <w:rFonts w:ascii="Segoe UI" w:hAnsi="Segoe UI" w:eastAsia="Segoe UI" w:cs="Segoe UI"/>
+                <w:color w:val="595959"/>
+                <w:sz w:val="17"/>
+                <w:szCs w:val="17"/>
+              </w:rPr>
+              <w:t xml:space="preserve">MCP support</w:t>
+            </w:r>
+          </w:p>
+        </w:tc>
+        <w:tc>
+          <w:tcPr>
+            <w:tcW w:w="5838" w:type="dxa"/>
+            <w:shd w:val="clear" w:color="auto" w:fill="DEEAF6"/>
+            <w:tcMar>
+              <w:top w:w="90" w:type="dxa"/>
+              <w:left w:w="110" w:type="dxa"/>
+              <w:bottom w:w="90" w:type="dxa"/>
+              <w:right w:w="110" w:type="dxa"/>
+            </w:tcMar>
+            <w:vAlign w:val="center"/>
+          </w:tcPr>
+          <w:p>
+            <w:pPr>
+              <w:spacing w:before="40" w:after="40" w:line="252" w:lineRule="auto"/>
+              <w:jc w:val="center"/>
+            </w:pPr>
+            <w:r>
+              <w:rPr>
+                <w:rFonts w:ascii="Microsoft YaHei" w:hAnsi="Microsoft YaHei" w:eastAsia="Microsoft YaHei" w:cs="Microsoft YaHei"/>
+                <w:b/>
+                <w:color w:val="000000"/>
+                <w:sz w:val="20"/>
+                <w:szCs w:val="20"/>
+              </w:rPr>
+              <w:t>配置位置</w:t>
+            </w:r>
+          </w:p>
+          <w:p>
+            <w:pPr>
+              <w:spacing w:before="40" w:after="40" w:line="252" w:lineRule="auto"/>
+              <w:jc w:val="center"/>
+            </w:pPr>
+            <w:r>
+              <w:rPr>
+                <w:rFonts w:ascii="Segoe UI" w:hAnsi="Segoe UI" w:eastAsia="Segoe UI" w:cs="Segoe UI"/>
+                <w:color w:val="595959"/>
+                <w:sz w:val="17"/>
+                <w:szCs w:val="17"/>
+              </w:rPr>
+              <w:t xml:space="preserve">Config location</w:t>
+            </w:r>
+          </w:p>
+        </w:tc>
+      </w:tr>
+      <w:tr>
+        <w:tc>
+          <w:tcPr>
+            <w:tcW w:w="2200" w:type="dxa"/>
+            <w:tcMar>
+              <w:top w:w="90" w:type="dxa"/>
+              <w:left w:w="110" w:type="dxa"/>
+              <w:bottom w:w="90" w:type="dxa"/>
+              <w:right w:w="110" w:type="dxa"/>
+            </w:tcMar>
+            <w:vAlign w:val="center"/>
+          </w:tcPr>
+          <w:p>
+            <w:pPr>
+              <w:spacing w:before="40" w:after="40" w:line="252" w:lineRule="auto"/>
+            </w:pPr>
+            <w:r>
+              <w:rPr>
+                <w:rFonts w:ascii="Microsoft YaHei" w:hAnsi="Microsoft YaHei" w:eastAsia="Microsoft YaHei" w:cs="Microsoft YaHei"/>
+                <w:b/>
+                <w:color w:val="000000"/>
+                <w:sz w:val="18"/>
+                <w:szCs w:val="18"/>
+              </w:rPr>
+              <w:t>WorkBuddy</w:t>
+            </w:r>
+          </w:p>
+          <w:p>
+            <w:pPr>
+              <w:spacing w:before="40" w:after="40" w:line="252" w:lineRule="auto"/>
+            </w:pPr>
+            <w:r>
+              <w:rPr>
+                <w:rFonts w:ascii="Segoe UI" w:hAnsi="Segoe UI" w:eastAsia="Segoe UI" w:cs="Segoe UI"/>
+                <w:color w:val="595959"/>
+                <w:sz w:val="16"/>
+                <w:szCs w:val="16"/>
+              </w:rPr>
+              <w:t>WorkBuddy</w:t>
+            </w:r>
+          </w:p>
+        </w:tc>
+        <w:tc>
+          <w:tcPr>
+            <w:tcW w:w="1600" w:type="dxa"/>
+            <w:tcMar>
+              <w:top w:w="90" w:type="dxa"/>
+              <w:left w:w="110" w:type="dxa"/>
+              <w:bottom w:w="90" w:type="dxa"/>
+              <w:right w:w="110" w:type="dxa"/>
+            </w:tcMar>
+            <w:vAlign w:val="center"/>
+          </w:tcPr>
+          <w:p>
+            <w:pPr>
+              <w:spacing w:before="40" w:after="40" w:line="252" w:lineRule="auto"/>
+              <w:jc w:val="center"/>
+            </w:pPr>
+            <w:r>
+              <w:rPr>
+                <w:rFonts w:ascii="Microsoft YaHei" w:hAnsi="Microsoft YaHei" w:eastAsia="Microsoft YaHei" w:cs="Microsoft YaHei"/>
+                <w:color w:val="000000"/>
+                <w:sz w:val="18"/>
+                <w:szCs w:val="18"/>
+              </w:rPr>
+              <w:t xml:space="preserve">✅ 原生</w:t>
+            </w:r>
+          </w:p>
+          <w:p>
+            <w:pPr>
+              <w:spacing w:before="40" w:after="40" w:line="252" w:lineRule="auto"/>
+              <w:jc w:val="center"/>
+            </w:pPr>
+            <w:r>
+              <w:rPr>
+                <w:rFonts w:ascii="Segoe UI" w:hAnsi="Segoe UI" w:eastAsia="Segoe UI" w:cs="Segoe UI"/>
+                <w:color w:val="595959"/>
+                <w:sz w:val="16"/>
+                <w:szCs w:val="16"/>
+              </w:rPr>
+              <w:t xml:space="preserve">✅ native</w:t>
+            </w:r>
+          </w:p>
+        </w:tc>
+        <w:tc>
+          <w:tcPr>
+            <w:tcW w:w="5838" w:type="dxa"/>
+            <w:tcMar>
+              <w:top w:w="90" w:type="dxa"/>
+              <w:left w:w="110" w:type="dxa"/>
+              <w:bottom w:w="90" w:type="dxa"/>
+              <w:right w:w="110" w:type="dxa"/>
+            </w:tcMar>
+            <w:vAlign w:val="center"/>
+          </w:tcPr>
+          <w:p>
+            <w:pPr>
+              <w:spacing w:before="40" w:after="40" w:line="252" w:lineRule="auto"/>
+            </w:pPr>
+            <w:r>
+              <w:rPr>
+                <w:rFonts w:ascii="Consolas" w:hAnsi="Consolas" w:eastAsia="Consolas" w:cs="Consolas"/>
+                <w:color w:val="000000"/>
+                <w:sz w:val="18"/>
+                <w:szCs w:val="18"/>
+              </w:rPr>
+              <w:t>~/.workbuddy/mcp.json</w:t>
+            </w:r>
+          </w:p>
+          <w:p>
+            <w:pPr>
+              <w:spacing w:before="40" w:after="40" w:line="252" w:lineRule="auto"/>
+            </w:pPr>
+            <w:r>
+              <w:rPr>
+                <w:rFonts w:ascii="Segoe UI" w:hAnsi="Segoe UI" w:eastAsia="Segoe UI" w:cs="Segoe UI"/>
+                <w:color w:val="595959"/>
+                <w:sz w:val="16"/>
+                <w:szCs w:val="16"/>
+              </w:rPr>
+              <w:t>~/.workbuddy/mcp.json</w:t>
+            </w:r>
+          </w:p>
+        </w:tc>
+      </w:tr>
+      <w:tr>
+        <w:tc>
+          <w:tcPr>
+            <w:tcW w:w="2200" w:type="dxa"/>
+            <w:tcMar>
+              <w:top w:w="90" w:type="dxa"/>
+              <w:left w:w="110" w:type="dxa"/>
+              <w:bottom w:w="90" w:type="dxa"/>
+              <w:right w:w="110" w:type="dxa"/>
+            </w:tcMar>
+            <w:vAlign w:val="center"/>
+          </w:tcPr>
+          <w:p>
+            <w:pPr>
+              <w:spacing w:before="40" w:after="40" w:line="252" w:lineRule="auto"/>
+            </w:pPr>
+            <w:r>
+              <w:rPr>
+                <w:rFonts w:ascii="Microsoft YaHei" w:hAnsi="Microsoft YaHei" w:eastAsia="Microsoft YaHei" w:cs="Microsoft YaHei"/>
+                <w:b/>
+                <w:color w:val="000000"/>
+                <w:sz w:val="18"/>
+                <w:szCs w:val="18"/>
+              </w:rPr>
+              <w:t xml:space="preserve">Claude Desktop</w:t>
+            </w:r>
+          </w:p>
+          <w:p>
+            <w:pPr>
+              <w:spacing w:before="40" w:after="40" w:line="252" w:lineRule="auto"/>
+            </w:pPr>
+            <w:r>
+              <w:rPr>
+                <w:rFonts w:ascii="Segoe UI" w:hAnsi="Segoe UI" w:eastAsia="Segoe UI" w:cs="Segoe UI"/>
+                <w:color w:val="595959"/>
+                <w:sz w:val="16"/>
+                <w:szCs w:val="16"/>
+              </w:rPr>
+              <w:t xml:space="preserve">Claude Desktop</w:t>
+            </w:r>
+          </w:p>
+        </w:tc>
+        <w:tc>
+          <w:tcPr>
+            <w:tcW w:w="1600" w:type="dxa"/>
+            <w:tcMar>
+              <w:top w:w="90" w:type="dxa"/>
+              <w:left w:w="110" w:type="dxa"/>
+              <w:bottom w:w="90" w:type="dxa"/>
+              <w:right w:w="110" w:type="dxa"/>
+            </w:tcMar>
+            <w:vAlign w:val="center"/>
+          </w:tcPr>
+          <w:p>
+            <w:pPr>
+              <w:spacing w:before="40" w:after="40" w:line="252" w:lineRule="auto"/>
+              <w:jc w:val="center"/>
+            </w:pPr>
+            <w:r>
+              <w:rPr>
+                <w:rFonts w:ascii="Microsoft YaHei" w:hAnsi="Microsoft YaHei" w:eastAsia="Microsoft YaHei" w:cs="Microsoft YaHei"/>
+                <w:color w:val="000000"/>
+                <w:sz w:val="18"/>
+                <w:szCs w:val="18"/>
+              </w:rPr>
+              <w:t xml:space="preserve">✅ 原生（MCP 创建者）</w:t>
+            </w:r>
+          </w:p>
+          <w:p>
+            <w:pPr>
+              <w:spacing w:before="40" w:after="40" w:line="252" w:lineRule="auto"/>
+              <w:jc w:val="center"/>
+            </w:pPr>
+            <w:r>
+              <w:rPr>
+                <w:rFonts w:ascii="Segoe UI" w:hAnsi="Segoe UI" w:eastAsia="Segoe UI" w:cs="Segoe UI"/>
+                <w:color w:val="595959"/>
+                <w:sz w:val="16"/>
+                <w:szCs w:val="16"/>
+              </w:rPr>
+              <w:t xml:space="preserve">✅ native (MCP creator)</w:t>
+            </w:r>
+          </w:p>
+        </w:tc>
+        <w:tc>
+          <w:tcPr>
+            <w:tcW w:w="5838" w:type="dxa"/>
+            <w:tcMar>
+              <w:top w:w="90" w:type="dxa"/>
+              <w:left w:w="110" w:type="dxa"/>
+              <w:bottom w:w="90" w:type="dxa"/>
+              <w:right w:w="110" w:type="dxa"/>
+            </w:tcMar>
+            <w:vAlign w:val="center"/>
+          </w:tcPr>
+          <w:p>
+            <w:pPr>
+              <w:spacing w:before="40" w:after="40" w:line="252" w:lineRule="auto"/>
+            </w:pPr>
+            <w:r>
+              <w:rPr>
+                <w:rFonts w:ascii="Consolas" w:hAnsi="Consolas" w:eastAsia="Consolas" w:cs="Consolas"/>
+                <w:color w:val="000000"/>
+                <w:sz w:val="18"/>
+                <w:szCs w:val="18"/>
+              </w:rPr>
+              <w:t>claude_desktop_config.json</w:t>
+            </w:r>
+          </w:p>
+          <w:p>
+            <w:pPr>
+              <w:spacing w:before="40" w:after="40" w:line="252" w:lineRule="auto"/>
+            </w:pPr>
+            <w:r>
+              <w:rPr>
+                <w:rFonts w:ascii="Segoe UI" w:hAnsi="Segoe UI" w:eastAsia="Segoe UI" w:cs="Segoe UI"/>
+                <w:color w:val="595959"/>
+                <w:sz w:val="16"/>
+                <w:szCs w:val="16"/>
+              </w:rPr>
+              <w:t>claude_desktop_config.json</w:t>
+            </w:r>
+          </w:p>
+        </w:tc>
+      </w:tr>
+      <w:tr>
+        <w:tc>
+          <w:tcPr>
+            <w:tcW w:w="2200" w:type="dxa"/>
+            <w:tcMar>
+              <w:top w:w="90" w:type="dxa"/>
+              <w:left w:w="110" w:type="dxa"/>
+              <w:bottom w:w="90" w:type="dxa"/>
+              <w:right w:w="110" w:type="dxa"/>
+            </w:tcMar>
+            <w:vAlign w:val="center"/>
+          </w:tcPr>
+          <w:p>
+            <w:pPr>
+              <w:spacing w:before="40" w:after="40" w:line="252" w:lineRule="auto"/>
+            </w:pPr>
+            <w:r>
+              <w:rPr>
+                <w:rFonts w:ascii="Microsoft YaHei" w:hAnsi="Microsoft YaHei" w:eastAsia="Microsoft YaHei" w:cs="Microsoft YaHei"/>
+                <w:b/>
+                <w:color w:val="000000"/>
+                <w:sz w:val="18"/>
+                <w:szCs w:val="18"/>
+              </w:rPr>
+              <w:t>Cursor</w:t>
+            </w:r>
+          </w:p>
+          <w:p>
+            <w:pPr>
+              <w:spacing w:before="40" w:after="40" w:line="252" w:lineRule="auto"/>
+            </w:pPr>
+            <w:r>
+              <w:rPr>
+                <w:rFonts w:ascii="Segoe UI" w:hAnsi="Segoe UI" w:eastAsia="Segoe UI" w:cs="Segoe UI"/>
+                <w:color w:val="595959"/>
+                <w:sz w:val="16"/>
+                <w:szCs w:val="16"/>
+              </w:rPr>
+              <w:t>Cursor</w:t>
+            </w:r>
+          </w:p>
+        </w:tc>
+        <w:tc>
+          <w:tcPr>
+            <w:tcW w:w="1600" w:type="dxa"/>
+            <w:tcMar>
+              <w:top w:w="90" w:type="dxa"/>
+              <w:left w:w="110" w:type="dxa"/>
+              <w:bottom w:w="90" w:type="dxa"/>
+              <w:right w:w="110" w:type="dxa"/>
+            </w:tcMar>
+            <w:vAlign w:val="center"/>
+          </w:tcPr>
+          <w:p>
+            <w:pPr>
+              <w:spacing w:before="40" w:after="40" w:line="252" w:lineRule="auto"/>
+              <w:jc w:val="center"/>
+            </w:pPr>
+            <w:r>
+              <w:rPr>
+                <w:rFonts w:ascii="Microsoft YaHei" w:hAnsi="Microsoft YaHei" w:eastAsia="Microsoft YaHei" w:cs="Microsoft YaHei"/>
+                <w:color w:val="000000"/>
+                <w:sz w:val="18"/>
+                <w:szCs w:val="18"/>
+              </w:rPr>
+              <w:t>✅</w:t>
+            </w:r>
+          </w:p>
+          <w:p>
+            <w:pPr>
+              <w:spacing w:before="40" w:after="40" w:line="252" w:lineRule="auto"/>
+              <w:jc w:val="center"/>
+            </w:pPr>
+            <w:r>
+              <w:rPr>
+                <w:rFonts w:ascii="Segoe UI" w:hAnsi="Segoe UI" w:eastAsia="Segoe UI" w:cs="Segoe UI"/>
+                <w:color w:val="595959"/>
+                <w:sz w:val="16"/>
+                <w:szCs w:val="16"/>
+              </w:rPr>
+              <w:t>✅</w:t>
+            </w:r>
+          </w:p>
+        </w:tc>
+        <w:tc>
+          <w:tcPr>
+            <w:tcW w:w="5838" w:type="dxa"/>
+            <w:tcMar>
+              <w:top w:w="90" w:type="dxa"/>
+              <w:left w:w="110" w:type="dxa"/>
+              <w:bottom w:w="90" w:type="dxa"/>
+              <w:right w:w="110" w:type="dxa"/>
+            </w:tcMar>
+            <w:vAlign w:val="center"/>
+          </w:tcPr>
+          <w:p>
+            <w:pPr>
+              <w:spacing w:before="40" w:after="40" w:line="252" w:lineRule="auto"/>
+            </w:pPr>
+            <w:r>
+              <w:rPr>
+                <w:rFonts w:ascii="Microsoft YaHei" w:hAnsi="Microsoft YaHei" w:eastAsia="Microsoft YaHei" w:cs="Microsoft YaHei"/>
+                <w:color w:val="000000"/>
+                <w:sz w:val="18"/>
+                <w:szCs w:val="18"/>
+              </w:rPr>
+              <w:t xml:space="preserve">Cursor Settings → MCP</w:t>
+            </w:r>
+          </w:p>
+          <w:p>
+            <w:pPr>
+              <w:spacing w:before="40" w:after="40" w:line="252" w:lineRule="auto"/>
+            </w:pPr>
+            <w:r>
+              <w:rPr>
+                <w:rFonts w:ascii="Segoe UI" w:hAnsi="Segoe UI" w:eastAsia="Segoe UI" w:cs="Segoe UI"/>
+                <w:color w:val="595959"/>
+                <w:sz w:val="16"/>
+                <w:szCs w:val="16"/>
+              </w:rPr>
+              <w:t xml:space="preserve">Cursor Settings → MCP</w:t>
+            </w:r>
+          </w:p>
+        </w:tc>
+      </w:tr>
+      <w:tr>
+        <w:tc>
+          <w:tcPr>
+            <w:tcW w:w="2200" w:type="dxa"/>
+            <w:tcMar>
+              <w:top w:w="90" w:type="dxa"/>
+              <w:left w:w="110" w:type="dxa"/>
+              <w:bottom w:w="90" w:type="dxa"/>
+              <w:right w:w="110" w:type="dxa"/>
+            </w:tcMar>
+            <w:vAlign w:val="center"/>
+          </w:tcPr>
+          <w:p>
+            <w:pPr>
+              <w:spacing w:before="40" w:after="40" w:line="252" w:lineRule="auto"/>
+            </w:pPr>
+            <w:r>
+              <w:rPr>
+                <w:rFonts w:ascii="Microsoft YaHei" w:hAnsi="Microsoft YaHei" w:eastAsia="Microsoft YaHei" w:cs="Microsoft YaHei"/>
+                <w:b/>
+                <w:color w:val="000000"/>
+                <w:sz w:val="18"/>
+                <w:szCs w:val="18"/>
+              </w:rPr>
+              <w:t xml:space="preserve">Codex CLI (OpenAI)</w:t>
+            </w:r>
+          </w:p>
+          <w:p>
+            <w:pPr>
+              <w:spacing w:before="40" w:after="40" w:line="252" w:lineRule="auto"/>
+            </w:pPr>
+            <w:r>
+              <w:rPr>
+                <w:rFonts w:ascii="Segoe UI" w:hAnsi="Segoe UI" w:eastAsia="Segoe UI" w:cs="Segoe UI"/>
+                <w:color w:val="595959"/>
+                <w:sz w:val="16"/>
+                <w:szCs w:val="16"/>
+              </w:rPr>
+              <w:t xml:space="preserve">Codex CLI (OpenAI)</w:t>
+            </w:r>
+          </w:p>
+        </w:tc>
+        <w:tc>
+          <w:tcPr>
+            <w:tcW w:w="1600" w:type="dxa"/>
+            <w:tcMar>
+              <w:top w:w="90" w:type="dxa"/>
+              <w:left w:w="110" w:type="dxa"/>
+              <w:bottom w:w="90" w:type="dxa"/>
+              <w:right w:w="110" w:type="dxa"/>
+            </w:tcMar>
+            <w:vAlign w:val="center"/>
+          </w:tcPr>
+          <w:p>
+            <w:pPr>
+              <w:spacing w:before="40" w:after="40" w:line="252" w:lineRule="auto"/>
+              <w:jc w:val="center"/>
+            </w:pPr>
+            <w:r>
+              <w:rPr>
+                <w:rFonts w:ascii="Microsoft YaHei" w:hAnsi="Microsoft YaHei" w:eastAsia="Microsoft YaHei" w:cs="Microsoft YaHei"/>
+                <w:color w:val="000000"/>
+                <w:sz w:val="18"/>
+                <w:szCs w:val="18"/>
+              </w:rPr>
+              <w:t>✅</w:t>
+            </w:r>
+          </w:p>
+          <w:p>
+            <w:pPr>
+              <w:spacing w:before="40" w:after="40" w:line="252" w:lineRule="auto"/>
+              <w:jc w:val="center"/>
+            </w:pPr>
+            <w:r>
+              <w:rPr>
+                <w:rFonts w:ascii="Segoe UI" w:hAnsi="Segoe UI" w:eastAsia="Segoe UI" w:cs="Segoe UI"/>
+                <w:color w:val="595959"/>
+                <w:sz w:val="16"/>
+                <w:szCs w:val="16"/>
+              </w:rPr>
+              <w:t>✅</w:t>
+            </w:r>
+          </w:p>
+        </w:tc>
+        <w:tc>
+          <w:tcPr>
+            <w:tcW w:w="5838" w:type="dxa"/>
+            <w:tcMar>
+              <w:top w:w="90" w:type="dxa"/>
+              <w:left w:w="110" w:type="dxa"/>
+              <w:bottom w:w="90" w:type="dxa"/>
+              <w:right w:w="110" w:type="dxa"/>
+            </w:tcMar>
+            <w:vAlign w:val="center"/>
+          </w:tcPr>
+          <w:p>
+            <w:pPr>
+              <w:spacing w:before="40" w:after="40" w:line="252" w:lineRule="auto"/>
+            </w:pPr>
+            <w:r>
+              <w:rPr>
+                <w:rFonts w:ascii="Consolas" w:hAnsi="Consolas" w:eastAsia="Consolas" w:cs="Consolas"/>
+                <w:color w:val="000000"/>
+                <w:sz w:val="18"/>
+                <w:szCs w:val="18"/>
+              </w:rPr>
+              <w:t xml:space="preserve">~/.codex/config.json → mcpServers</w:t>
+            </w:r>
+          </w:p>
+          <w:p>
+            <w:pPr>
+              <w:spacing w:before="40" w:after="40" w:line="252" w:lineRule="auto"/>
+            </w:pPr>
+            <w:r>
+              <w:rPr>
+                <w:rFonts w:ascii="Segoe UI" w:hAnsi="Segoe UI" w:eastAsia="Segoe UI" w:cs="Segoe UI"/>
+                <w:color w:val="595959"/>
+                <w:sz w:val="16"/>
+                <w:szCs w:val="16"/>
+              </w:rPr>
+              <w:t xml:space="preserve">~/.codex/config.json → mcpServers</w:t>
+            </w:r>
+          </w:p>
+        </w:tc>
+      </w:tr>
+      <w:tr>
+        <w:tc>
+          <w:tcPr>
+            <w:tcW w:w="2200" w:type="dxa"/>
+            <w:tcMar>
+              <w:top w:w="90" w:type="dxa"/>
+              <w:left w:w="110" w:type="dxa"/>
+              <w:bottom w:w="90" w:type="dxa"/>
+              <w:right w:w="110" w:type="dxa"/>
+            </w:tcMar>
+            <w:vAlign w:val="center"/>
+          </w:tcPr>
+          <w:p>
+            <w:pPr>
+              <w:spacing w:before="40" w:after="40" w:line="252" w:lineRule="auto"/>
+            </w:pPr>
+            <w:r>
+              <w:rPr>
+                <w:rFonts w:ascii="Microsoft YaHei" w:hAnsi="Microsoft YaHei" w:eastAsia="Microsoft YaHei" w:cs="Microsoft YaHei"/>
+                <w:b/>
+                <w:color w:val="000000"/>
+                <w:sz w:val="18"/>
+                <w:szCs w:val="18"/>
+              </w:rPr>
+              <w:t>Cline</w:t>
+            </w:r>
+          </w:p>
+          <w:p>
+            <w:pPr>
+              <w:spacing w:before="40" w:after="40" w:line="252" w:lineRule="auto"/>
+            </w:pPr>
+            <w:r>
+              <w:rPr>
+                <w:rFonts w:ascii="Segoe UI" w:hAnsi="Segoe UI" w:eastAsia="Segoe UI" w:cs="Segoe UI"/>
+                <w:color w:val="595959"/>
+                <w:sz w:val="16"/>
+                <w:szCs w:val="16"/>
+              </w:rPr>
+              <w:t>Cline</w:t>
+            </w:r>
+          </w:p>
+        </w:tc>
+        <w:tc>
+          <w:tcPr>
+            <w:tcW w:w="1600" w:type="dxa"/>
+            <w:tcMar>
+              <w:top w:w="90" w:type="dxa"/>
+              <w:left w:w="110" w:type="dxa"/>
+              <w:bottom w:w="90" w:type="dxa"/>
+              <w:right w:w="110" w:type="dxa"/>
+            </w:tcMar>
+            <w:vAlign w:val="center"/>
+          </w:tcPr>
+          <w:p>
+            <w:pPr>
+              <w:spacing w:before="40" w:after="40" w:line="252" w:lineRule="auto"/>
+              <w:jc w:val="center"/>
+            </w:pPr>
+            <w:r>
+              <w:rPr>
+                <w:rFonts w:ascii="Microsoft YaHei" w:hAnsi="Microsoft YaHei" w:eastAsia="Microsoft YaHei" w:cs="Microsoft YaHei"/>
+                <w:color w:val="000000"/>
+                <w:sz w:val="18"/>
+                <w:szCs w:val="18"/>
+              </w:rPr>
+              <w:t>✅</w:t>
+            </w:r>
+          </w:p>
+          <w:p>
+            <w:pPr>
+              <w:spacing w:before="40" w:after="40" w:line="252" w:lineRule="auto"/>
+              <w:jc w:val="center"/>
+            </w:pPr>
+            <w:r>
+              <w:rPr>
+                <w:rFonts w:ascii="Segoe UI" w:hAnsi="Segoe UI" w:eastAsia="Segoe UI" w:cs="Segoe UI"/>
+                <w:color w:val="595959"/>
+                <w:sz w:val="16"/>
+                <w:szCs w:val="16"/>
+              </w:rPr>
+              <w:t>✅</w:t>
+            </w:r>
+          </w:p>
+        </w:tc>
+        <w:tc>
+          <w:tcPr>
+            <w:tcW w:w="5838" w:type="dxa"/>
+            <w:tcMar>
+              <w:top w:w="90" w:type="dxa"/>
+              <w:left w:w="110" w:type="dxa"/>
+              <w:bottom w:w="90" w:type="dxa"/>
+              <w:right w:w="110" w:type="dxa"/>
+            </w:tcMar>
+            <w:vAlign w:val="center"/>
+          </w:tcPr>
+          <w:p>
+            <w:pPr>
+              <w:spacing w:before="40" w:after="40" w:line="252" w:lineRule="auto"/>
+            </w:pPr>
+            <w:r>
+              <w:rPr>
+                <w:rFonts w:ascii="Microsoft YaHei" w:hAnsi="Microsoft YaHei" w:eastAsia="Microsoft YaHei" w:cs="Microsoft YaHei"/>
+                <w:color w:val="000000"/>
+                <w:sz w:val="18"/>
+                <w:szCs w:val="18"/>
+              </w:rPr>
+              <w:t xml:space="preserve">VS Code Cline MCP 设置</w:t>
+            </w:r>
+          </w:p>
+          <w:p>
+            <w:pPr>
+              <w:spacing w:before="40" w:after="40" w:line="252" w:lineRule="auto"/>
+            </w:pPr>
+            <w:r>
+              <w:rPr>
+                <w:rFonts w:ascii="Segoe UI" w:hAnsi="Segoe UI" w:eastAsia="Segoe UI" w:cs="Segoe UI"/>
+                <w:color w:val="595959"/>
+                <w:sz w:val="16"/>
+                <w:szCs w:val="16"/>
+              </w:rPr>
+              <w:t xml:space="preserve">VS Code Cline MCP settings</w:t>
+            </w:r>
+          </w:p>
+        </w:tc>
+      </w:tr>
+      <w:tr>
+        <w:tc>
+          <w:tcPr>
+            <w:tcW w:w="2200" w:type="dxa"/>
+            <w:tcMar>
+              <w:top w:w="90" w:type="dxa"/>
+              <w:left w:w="110" w:type="dxa"/>
+              <w:bottom w:w="90" w:type="dxa"/>
+              <w:right w:w="110" w:type="dxa"/>
+            </w:tcMar>
+            <w:vAlign w:val="center"/>
+          </w:tcPr>
+          <w:p>
+            <w:pPr>
+              <w:spacing w:before="40" w:after="40" w:line="252" w:lineRule="auto"/>
+            </w:pPr>
+            <w:r>
+              <w:rPr>
+                <w:rFonts w:ascii="Microsoft YaHei" w:hAnsi="Microsoft YaHei" w:eastAsia="Microsoft YaHei" w:cs="Microsoft YaHei"/>
+                <w:b/>
+                <w:color w:val="000000"/>
+                <w:sz w:val="18"/>
+                <w:szCs w:val="18"/>
+              </w:rPr>
+              <w:t xml:space="preserve">扣子 / Coze（字节跳动）</w:t>
+            </w:r>
+          </w:p>
+          <w:p>
+            <w:pPr>
+              <w:spacing w:before="40" w:after="40" w:line="252" w:lineRule="auto"/>
+            </w:pPr>
+            <w:r>
+              <w:rPr>
+                <w:rFonts w:ascii="Segoe UI" w:hAnsi="Segoe UI" w:eastAsia="Segoe UI" w:cs="Segoe UI"/>
+                <w:color w:val="595959"/>
+                <w:sz w:val="16"/>
+                <w:szCs w:val="16"/>
+              </w:rPr>
+              <w:t xml:space="preserve">Coze (ByteDance)</w:t>
+            </w:r>
+          </w:p>
+        </w:tc>
+        <w:tc>
+          <w:tcPr>
+            <w:tcW w:w="1600" w:type="dxa"/>
+            <w:tcMar>
+              <w:top w:w="90" w:type="dxa"/>
+              <w:left w:w="110" w:type="dxa"/>
+              <w:bottom w:w="90" w:type="dxa"/>
+              <w:right w:w="110" w:type="dxa"/>
+            </w:tcMar>
+            <w:vAlign w:val="center"/>
+          </w:tcPr>
+          <w:p>
+            <w:pPr>
+              <w:spacing w:before="40" w:after="40" w:line="252" w:lineRule="auto"/>
+              <w:jc w:val="center"/>
+            </w:pPr>
+            <w:r>
+              <w:rPr>
+                <w:rFonts w:ascii="Microsoft YaHei" w:hAnsi="Microsoft YaHei" w:eastAsia="Microsoft YaHei" w:cs="Microsoft YaHei"/>
+                <w:color w:val="000000"/>
+                <w:sz w:val="18"/>
+                <w:szCs w:val="18"/>
+              </w:rPr>
+              <w:t>✅</w:t>
+            </w:r>
+          </w:p>
+          <w:p>
+            <w:pPr>
+              <w:spacing w:before="40" w:after="40" w:line="252" w:lineRule="auto"/>
+              <w:jc w:val="center"/>
+            </w:pPr>
+            <w:r>
+              <w:rPr>
+                <w:rFonts w:ascii="Segoe UI" w:hAnsi="Segoe UI" w:eastAsia="Segoe UI" w:cs="Segoe UI"/>
+                <w:color w:val="595959"/>
+                <w:sz w:val="16"/>
+                <w:szCs w:val="16"/>
+              </w:rPr>
+              <w:t>✅</w:t>
+            </w:r>
+          </w:p>
+        </w:tc>
+        <w:tc>
+          <w:tcPr>
+            <w:tcW w:w="5838" w:type="dxa"/>
+            <w:tcMar>
+              <w:top w:w="90" w:type="dxa"/>
+              <w:left w:w="110" w:type="dxa"/>
+              <w:bottom w:w="90" w:type="dxa"/>
+              <w:right w:w="110" w:type="dxa"/>
+            </w:tcMar>
+            <w:vAlign w:val="center"/>
+          </w:tcPr>
+          <w:p>
+            <w:pPr>
+              <w:spacing w:before="40" w:after="40" w:line="252" w:lineRule="auto"/>
+            </w:pPr>
+            <w:r>
+              <w:rPr>
+                <w:rFonts w:ascii="Microsoft YaHei" w:hAnsi="Microsoft YaHei" w:eastAsia="Microsoft YaHei" w:cs="Microsoft YaHei"/>
+                <w:color w:val="000000"/>
+                <w:sz w:val="18"/>
+                <w:szCs w:val="18"/>
+              </w:rPr>
+              <w:t xml:space="preserve">Coze 插件 → MCP 服务端</w:t>
+            </w:r>
+          </w:p>
+          <w:p>
+            <w:pPr>
+              <w:spacing w:before="40" w:after="40" w:line="252" w:lineRule="auto"/>
+            </w:pPr>
+            <w:r>
+              <w:rPr>
+                <w:rFonts w:ascii="Segoe UI" w:hAnsi="Segoe UI" w:eastAsia="Segoe UI" w:cs="Segoe UI"/>
+                <w:color w:val="595959"/>
+                <w:sz w:val="16"/>
+                <w:szCs w:val="16"/>
+              </w:rPr>
+              <w:t xml:space="preserve">Coze plugin → MCP server</w:t>
+            </w:r>
+          </w:p>
+        </w:tc>
+      </w:tr>
+      <w:tr>
+        <w:tc>
+          <w:tcPr>
+            <w:tcW w:w="2200" w:type="dxa"/>
+            <w:tcMar>
+              <w:top w:w="90" w:type="dxa"/>
+              <w:left w:w="110" w:type="dxa"/>
+              <w:bottom w:w="90" w:type="dxa"/>
+              <w:right w:w="110" w:type="dxa"/>
+            </w:tcMar>
+            <w:vAlign w:val="center"/>
+          </w:tcPr>
+          <w:p>
+            <w:pPr>
+              <w:spacing w:before="40" w:after="40" w:line="252" w:lineRule="auto"/>
+            </w:pPr>
+            <w:r>
+              <w:rPr>
+                <w:rFonts w:ascii="Microsoft YaHei" w:hAnsi="Microsoft YaHei" w:eastAsia="Microsoft YaHei" w:cs="Microsoft YaHei"/>
+                <w:b/>
+                <w:color w:val="000000"/>
+                <w:sz w:val="18"/>
+                <w:szCs w:val="18"/>
+              </w:rPr>
+              <w:t xml:space="preserve">通义千问 / Qwen Code</w:t>
+            </w:r>
+          </w:p>
+          <w:p>
+            <w:pPr>
+              <w:spacing w:before="40" w:after="40" w:line="252" w:lineRule="auto"/>
+            </w:pPr>
+            <w:r>
+              <w:rPr>
+                <w:rFonts w:ascii="Segoe UI" w:hAnsi="Segoe UI" w:eastAsia="Segoe UI" w:cs="Segoe UI"/>
+                <w:color w:val="595959"/>
+                <w:sz w:val="16"/>
+                <w:szCs w:val="16"/>
+              </w:rPr>
+              <w:t xml:space="preserve">Qwen Code / Tongyi</w:t>
+            </w:r>
+          </w:p>
+        </w:tc>
+        <w:tc>
+          <w:tcPr>
+            <w:tcW w:w="1600" w:type="dxa"/>
+            <w:tcMar>
+              <w:top w:w="90" w:type="dxa"/>
+              <w:left w:w="110" w:type="dxa"/>
+              <w:bottom w:w="90" w:type="dxa"/>
+              <w:right w:w="110" w:type="dxa"/>
+            </w:tcMar>
+            <w:vAlign w:val="center"/>
+          </w:tcPr>
+          <w:p>
+            <w:pPr>
+              <w:spacing w:before="40" w:after="40" w:line="252" w:lineRule="auto"/>
+              <w:jc w:val="center"/>
+            </w:pPr>
+            <w:r>
+              <w:rPr>
+                <w:rFonts w:ascii="Microsoft YaHei" w:hAnsi="Microsoft YaHei" w:eastAsia="Microsoft YaHei" w:cs="Microsoft YaHei"/>
+                <w:color w:val="000000"/>
+                <w:sz w:val="18"/>
+                <w:szCs w:val="18"/>
+              </w:rPr>
+              <w:t>✅</w:t>
+            </w:r>
+          </w:p>
+          <w:p>
+            <w:pPr>
+              <w:spacing w:before="40" w:after="40" w:line="252" w:lineRule="auto"/>
+              <w:jc w:val="center"/>
+            </w:pPr>
+            <w:r>
+              <w:rPr>
+                <w:rFonts w:ascii="Segoe UI" w:hAnsi="Segoe UI" w:eastAsia="Segoe UI" w:cs="Segoe UI"/>
+                <w:color w:val="595959"/>
+                <w:sz w:val="16"/>
+                <w:szCs w:val="16"/>
+              </w:rPr>
+              <w:t>✅</w:t>
+            </w:r>
+          </w:p>
+        </w:tc>
+        <w:tc>
+          <w:tcPr>
+            <w:tcW w:w="5838" w:type="dxa"/>
+            <w:tcMar>
+              <w:top w:w="90" w:type="dxa"/>
+              <w:left w:w="110" w:type="dxa"/>
+              <w:bottom w:w="90" w:type="dxa"/>
+              <w:right w:w="110" w:type="dxa"/>
+            </w:tcMar>
+            <w:vAlign w:val="center"/>
+          </w:tcPr>
+          <w:p>
+            <w:pPr>
+              <w:spacing w:before="40" w:after="40" w:line="252" w:lineRule="auto"/>
+            </w:pPr>
+            <w:r>
+              <w:rPr>
+                <w:rFonts w:ascii="Microsoft YaHei" w:hAnsi="Microsoft YaHei" w:eastAsia="Microsoft YaHei" w:cs="Microsoft YaHei"/>
+                <w:color w:val="000000"/>
+                <w:sz w:val="18"/>
+                <w:szCs w:val="18"/>
+              </w:rPr>
+              <w:t xml:space="preserve">Qwen Code MCP 配置</w:t>
+            </w:r>
+          </w:p>
+          <w:p>
+            <w:pPr>
+              <w:spacing w:before="40" w:after="40" w:line="252" w:lineRule="auto"/>
+            </w:pPr>
+            <w:r>
+              <w:rPr>
+                <w:rFonts w:ascii="Segoe UI" w:hAnsi="Segoe UI" w:eastAsia="Segoe UI" w:cs="Segoe UI"/>
+                <w:color w:val="595959"/>
+                <w:sz w:val="16"/>
+                <w:szCs w:val="16"/>
+              </w:rPr>
+              <w:t xml:space="preserve">Qwen Code MCP config</w:t>
+            </w:r>
+          </w:p>
+        </w:tc>
+      </w:tr>
+      <w:tr>
+        <w:tc>
+          <w:tcPr>
+            <w:tcW w:w="2200" w:type="dxa"/>
+            <w:tcMar>
+              <w:top w:w="90" w:type="dxa"/>
+              <w:left w:w="110" w:type="dxa"/>
+              <w:bottom w:w="90" w:type="dxa"/>
+              <w:right w:w="110" w:type="dxa"/>
+            </w:tcMar>
+            <w:vAlign w:val="center"/>
+          </w:tcPr>
+          <w:p>
+            <w:pPr>
+              <w:spacing w:before="40" w:after="40" w:line="252" w:lineRule="auto"/>
+            </w:pPr>
+            <w:r>
+              <w:rPr>
+                <w:rFonts w:ascii="Microsoft YaHei" w:hAnsi="Microsoft YaHei" w:eastAsia="Microsoft YaHei" w:cs="Microsoft YaHei"/>
+                <w:b/>
+                <w:color w:val="000000"/>
+                <w:sz w:val="18"/>
+                <w:szCs w:val="18"/>
+              </w:rPr>
+              <w:t xml:space="preserve">豆包 / 其它 Agent</w:t>
+            </w:r>
+          </w:p>
+          <w:p>
+            <w:pPr>
+              <w:spacing w:before="40" w:after="40" w:line="252" w:lineRule="auto"/>
+            </w:pPr>
+            <w:r>
+              <w:rPr>
+                <w:rFonts w:ascii="Segoe UI" w:hAnsi="Segoe UI" w:eastAsia="Segoe UI" w:cs="Segoe UI"/>
+                <w:color w:val="595959"/>
+                <w:sz w:val="16"/>
+                <w:szCs w:val="16"/>
+              </w:rPr>
+              <w:t xml:space="preserve">Doubao / other agents</w:t>
+            </w:r>
+          </w:p>
+        </w:tc>
+        <w:tc>
+          <w:tcPr>
+            <w:tcW w:w="1600" w:type="dxa"/>
+            <w:tcMar>
+              <w:top w:w="90" w:type="dxa"/>
+              <w:left w:w="110" w:type="dxa"/>
+              <w:bottom w:w="90" w:type="dxa"/>
+              <w:right w:w="110" w:type="dxa"/>
+            </w:tcMar>
+            <w:vAlign w:val="center"/>
+          </w:tcPr>
+          <w:p>
+            <w:pPr>
+              <w:spacing w:before="40" w:after="40" w:line="252" w:lineRule="auto"/>
+              <w:jc w:val="center"/>
+            </w:pPr>
+            <w:r>
+              <w:rPr>
+                <w:rFonts w:ascii="Microsoft YaHei" w:hAnsi="Microsoft YaHei" w:eastAsia="Microsoft YaHei" w:cs="Microsoft YaHei"/>
+                <w:color w:val="000000"/>
+                <w:sz w:val="18"/>
+                <w:szCs w:val="18"/>
+              </w:rPr>
+              <w:t xml:space="preserve">⚠️ 需确认</w:t>
+            </w:r>
+          </w:p>
+          <w:p>
+            <w:pPr>
+              <w:spacing w:before="40" w:after="40" w:line="252" w:lineRule="auto"/>
+              <w:jc w:val="center"/>
+            </w:pPr>
+            <w:r>
+              <w:rPr>
+                <w:rFonts w:ascii="Segoe UI" w:hAnsi="Segoe UI" w:eastAsia="Segoe UI" w:cs="Segoe UI"/>
+                <w:color w:val="595959"/>
+                <w:sz w:val="16"/>
+                <w:szCs w:val="16"/>
+              </w:rPr>
+              <w:t xml:space="preserve">⚠️ verify</w:t>
+            </w:r>
+          </w:p>
+        </w:tc>
+        <w:tc>
+          <w:tcPr>
+            <w:tcW w:w="5838" w:type="dxa"/>
+            <w:tcMar>
+              <w:top w:w="90" w:type="dxa"/>
+              <w:left w:w="110" w:type="dxa"/>
+              <w:bottom w:w="90" w:type="dxa"/>
+              <w:right w:w="110" w:type="dxa"/>
+            </w:tcMar>
+            <w:vAlign w:val="center"/>
+          </w:tcPr>
+          <w:p>
+            <w:pPr>
+              <w:spacing w:before="40" w:after="40" w:line="252" w:lineRule="auto"/>
+            </w:pPr>
+            <w:r>
+              <w:rPr>
+                <w:rFonts w:ascii="Microsoft YaHei" w:hAnsi="Microsoft YaHei" w:eastAsia="Microsoft YaHei" w:cs="Microsoft YaHei"/>
+                <w:color w:val="000000"/>
+                <w:sz w:val="18"/>
+                <w:szCs w:val="18"/>
+              </w:rPr>
+              <w:t xml:space="preserve">若支持 MCP，按该 Agent 文档注册；若不支持，可手动跑 server.ts + 调用工具</w:t>
+            </w:r>
+          </w:p>
+          <w:p>
+            <w:pPr>
+              <w:spacing w:before="40" w:after="40" w:line="252" w:lineRule="auto"/>
+            </w:pPr>
+            <w:r>
+              <w:rPr>
+                <w:rFonts w:ascii="Segoe UI" w:hAnsi="Segoe UI" w:eastAsia="Segoe UI" w:cs="Segoe UI"/>
+                <w:color w:val="595959"/>
+                <w:sz w:val="16"/>
+                <w:szCs w:val="16"/>
+              </w:rPr>
+              <w:t xml:space="preserve">If it supports MCP, register per that agent's docs; if not, run server.ts manually and call tools</w:t>
+            </w:r>
+          </w:p>
+        </w:tc>
+      </w:tr>
+    </w:tbl>
+    <w:p>
+      <w:pPr>
+        <w:spacing w:before="0" w:after="120" w:line="276" w:lineRule="auto"/>
+      </w:pPr>
+    </w:p>
+    <w:p>
+      <w:pPr>
+        <w:shd w:val="clear" w:color="auto" w:fill="FFF2CC"/>
+        <w:spacing w:before="80" w:after="30" w:line="300" w:lineRule="auto"/>
+        <w:jc w:val="center"/>
+      </w:pPr>
+      <w:r>
+        <w:rPr>
+          <w:rFonts w:ascii="Microsoft YaHei" w:hAnsi="Microsoft YaHei" w:eastAsia="Microsoft YaHei" w:cs="Microsoft YaHei"/>
+          <w:b/>
+          <w:color w:val="1F3864"/>
+          <w:sz w:val="20"/>
+          <w:szCs w:val="20"/>
+        </w:rPr>
+        <w:t xml:space="preserve">一句话：只要你的 Agent 能跑 MCP stdio 服务端，这套写桥就能用——它只是一个标准的 MCP 服务，不依赖任何特定 Agent 的私有 API。</w:t>
+      </w:r>
+    </w:p>
+    <w:p>
+      <w:pPr>
+        <w:shd w:val="clear" w:color="auto" w:fill="FFF2CC"/>
+        <w:spacing w:before="0" w:after="200" w:line="300" w:lineRule="auto"/>
+        <w:jc w:val="center"/>
+      </w:pPr>
+      <w:r>
+        <w:rPr>
+          <w:rFonts w:ascii="Segoe UI" w:hAnsi="Segoe UI" w:eastAsia="Segoe UI" w:cs="Segoe UI"/>
+          <w:b/>
+          <w:color w:val="2E5C8A"/>
+          <w:sz w:val="18"/>
+          <w:szCs w:val="18"/>
+        </w:rPr>
+        <w:t xml:space="preserve">In short: if your agent can spawn an MCP stdio server, this bridge works — it's a standard MCP service with no dependency on any single vendor's proprietary API.</w:t>
+      </w:r>
+    </w:p>
     <w:p>
       <w:r>
         <w:br w:type="page"/>

</xml_diff>